<commit_message>
ActivityInfo uploads were added
</commit_message>
<xml_diff>
--- a/src/templates/act.docx
+++ b/src/templates/act.docx
@@ -1040,14 +1040,7 @@
           <w:rStyle w:val="Highlighted-boldChar"/>
           <w:lang w:val="uk-UA"/>
         </w:rPr>
-        <w:t xml:space="preserve"> </w:t>
-      </w:r>
-      <w:r>
-        <w:rPr>
-          <w:rStyle w:val="Highlighted-boldChar"/>
-          <w:lang w:val="uk-UA"/>
-        </w:rPr>
-        <w:t xml:space="preserve">| </w:t>
+        <w:t xml:space="preserve"> | </w:t>
       </w:r>
       <w:r>
         <w:rPr>
@@ -4830,7 +4823,6 @@
                 <w:szCs w:val="28"/>
                 <w:lang w:val="en-AU"/>
               </w:rPr>
-              <w:lastRenderedPageBreak/>
               <w:t>{#</w:t>
             </w:r>
             <w:r>
@@ -6074,16 +6066,7 @@
                 <w:szCs w:val="28"/>
                 <w:lang w:val="ru-RU"/>
               </w:rPr>
-              <w:t xml:space="preserve">Кількість осіб, які проживають у приміщеннях, (у разі, коли </w:t>
-            </w:r>
-            <w:r>
-              <w:rPr>
-                <w:noProof/>
-                <w:szCs w:val="28"/>
-                <w:lang w:val="ru-RU"/>
-              </w:rPr>
-              <w:lastRenderedPageBreak/>
-              <w:t>об’єкт використовується для проживання внутрішньо переміщених осіб)</w:t>
+              <w:t>Кількість осіб, які проживають у приміщеннях, (у разі, коли об’єкт використовується для проживання внутрішньо переміщених осіб)</w:t>
             </w:r>
           </w:p>
         </w:tc>
@@ -6100,7 +6083,6 @@
               <w:pStyle w:val="Highlighted-centered"/>
             </w:pPr>
             <w:r>
-              <w:lastRenderedPageBreak/>
               <w:t>{</w:t>
             </w:r>
             <w:r>
@@ -7534,7 +7516,6 @@
         <w:ind w:firstLine="540"/>
       </w:pPr>
       <w:r>
-        <w:lastRenderedPageBreak/>
         <w:t>Основні будівельні конструкції</w:t>
       </w:r>
     </w:p>
@@ -7805,7 +7786,43 @@
               <w:rPr>
                 <w:lang w:val="en-US"/>
               </w:rPr>
-              <w:t>.ceilingType</w:t>
+              <w:t>.ceilingType}</w:t>
+            </w:r>
+            <w:r>
+              <w:rPr>
+                <w:lang w:val="en-US"/>
+              </w:rPr>
+              <w:t xml:space="preserve">. </w:t>
+            </w:r>
+            <w:r>
+              <w:rPr>
+                <w:lang w:val="en-US"/>
+              </w:rPr>
+              <w:t>{/}</w:t>
+            </w:r>
+            <w:r>
+              <w:rPr>
+                <w:lang w:val="en-US"/>
+              </w:rPr>
+              <w:t>{</w:t>
+            </w:r>
+            <w:r>
+              <w:rPr>
+                <w:lang w:val="en-US"/>
+              </w:rPr>
+              <w:t>#</w:t>
+            </w:r>
+            <w:r>
+              <w:rPr>
+                <w:lang w:val="en-US"/>
+              </w:rPr>
+              <w:t>constructionElements</w:t>
+            </w:r>
+            <w:r>
+              <w:rPr>
+                <w:lang w:val="en-US"/>
+              </w:rPr>
+              <w:t>.ceilingCondition</w:t>
             </w:r>
             <w:r>
               <w:rPr>
@@ -7815,9 +7832,45 @@
             </w:r>
             <w:r>
               <w:rPr>
-                <w:lang w:val="en-US"/>
-              </w:rPr>
-              <w:t xml:space="preserve">. </w:t>
+                <w:lang w:val="uk-UA"/>
+              </w:rPr>
+              <w:t xml:space="preserve">Стан </w:t>
+            </w:r>
+            <w:r>
+              <w:rPr>
+                <w:lang w:val="en-US"/>
+              </w:rPr>
+              <w:t>{</w:t>
+            </w:r>
+            <w:r>
+              <w:rPr>
+                <w:lang w:val="en-US"/>
+              </w:rPr>
+              <w:t>constructionElements</w:t>
+            </w:r>
+            <w:r>
+              <w:rPr>
+                <w:lang w:val="en-US"/>
+              </w:rPr>
+              <w:t>.ceiling</w:t>
+            </w:r>
+            <w:r>
+              <w:rPr>
+                <w:lang w:val="en-US"/>
+              </w:rPr>
+              <w:t>Condition</w:t>
+            </w:r>
+            <w:r>
+              <w:rPr>
+                <w:lang w:val="en-US"/>
+              </w:rPr>
+              <w:t>}</w:t>
+            </w:r>
+            <w:r>
+              <w:rPr>
+                <w:lang w:val="en-US"/>
+              </w:rPr>
+              <w:t>.</w:t>
             </w:r>
             <w:r>
               <w:rPr>
@@ -7829,6 +7882,12 @@
               <w:rPr>
                 <w:lang w:val="en-US"/>
               </w:rPr>
+              <w:t xml:space="preserve"> </w:t>
+            </w:r>
+            <w:r>
+              <w:rPr>
+                <w:lang w:val="en-US"/>
+              </w:rPr>
               <w:t>{</w:t>
             </w:r>
             <w:r>
@@ -7847,109 +7906,7 @@
               <w:rPr>
                 <w:lang w:val="en-US"/>
               </w:rPr>
-              <w:t>.ceiling</w:t>
-            </w:r>
-            <w:r>
-              <w:rPr>
-                <w:lang w:val="en-US"/>
-              </w:rPr>
-              <w:t>Condition</w:t>
-            </w:r>
-            <w:r>
-              <w:rPr>
-                <w:lang w:val="en-US"/>
-              </w:rPr>
-              <w:t>}</w:t>
-            </w:r>
-            <w:r>
-              <w:rPr>
-                <w:lang w:val="uk-UA"/>
-              </w:rPr>
-              <w:t>Стан</w:t>
-            </w:r>
-            <w:r>
-              <w:rPr>
-                <w:lang w:val="uk-UA"/>
-              </w:rPr>
-              <w:t xml:space="preserve"> </w:t>
-            </w:r>
-            <w:r>
-              <w:rPr>
-                <w:lang w:val="en-US"/>
-              </w:rPr>
-              <w:t>{</w:t>
-            </w:r>
-            <w:r>
-              <w:rPr>
-                <w:lang w:val="en-US"/>
-              </w:rPr>
-              <w:t>constructionElements</w:t>
-            </w:r>
-            <w:r>
-              <w:rPr>
-                <w:lang w:val="en-US"/>
-              </w:rPr>
-              <w:t>.ceiling</w:t>
-            </w:r>
-            <w:r>
-              <w:rPr>
-                <w:lang w:val="en-US"/>
-              </w:rPr>
-              <w:t>Condition</w:t>
-            </w:r>
-            <w:r>
-              <w:rPr>
-                <w:lang w:val="en-US"/>
-              </w:rPr>
-              <w:t>}</w:t>
-            </w:r>
-            <w:r>
-              <w:rPr>
-                <w:lang w:val="en-US"/>
-              </w:rPr>
-              <w:t>.</w:t>
-            </w:r>
-            <w:r>
-              <w:rPr>
-                <w:lang w:val="en-US"/>
-              </w:rPr>
-              <w:t>{/}</w:t>
-            </w:r>
-            <w:r>
-              <w:rPr>
-                <w:lang w:val="en-US"/>
-              </w:rPr>
-              <w:t xml:space="preserve"> </w:t>
-            </w:r>
-            <w:r>
-              <w:rPr>
-                <w:lang w:val="en-US"/>
-              </w:rPr>
-              <w:t>{</w:t>
-            </w:r>
-            <w:r>
-              <w:rPr>
-                <w:lang w:val="en-US"/>
-              </w:rPr>
-              <w:t>#</w:t>
-            </w:r>
-            <w:r>
-              <w:rPr>
-                <w:lang w:val="en-US"/>
-              </w:rPr>
-              <w:t>constructionElements</w:t>
-            </w:r>
-            <w:r>
-              <w:rPr>
-                <w:lang w:val="en-US"/>
-              </w:rPr>
-              <w:t>.ceiling</w:t>
-            </w:r>
-            <w:r>
-              <w:rPr>
-                <w:lang w:val="en-US"/>
-              </w:rPr>
-              <w:t>Defects</w:t>
+              <w:t>.ceilingDefects</w:t>
             </w:r>
             <w:r>
               <w:rPr>
@@ -8103,6 +8060,90 @@
               <w:rPr>
                 <w:lang w:val="en-US"/>
               </w:rPr>
+              <w:t>.coatingType</w:t>
+            </w:r>
+            <w:r>
+              <w:rPr>
+                <w:lang w:val="en-US"/>
+              </w:rPr>
+              <w:t>}</w:t>
+            </w:r>
+            <w:r>
+              <w:rPr>
+                <w:lang w:val="uk-UA"/>
+              </w:rPr>
+              <w:t xml:space="preserve">Тип: </w:t>
+            </w:r>
+            <w:r>
+              <w:rPr>
+                <w:lang w:val="en-US"/>
+              </w:rPr>
+              <w:t>{</w:t>
+            </w:r>
+            <w:r>
+              <w:rPr>
+                <w:lang w:val="en-US"/>
+              </w:rPr>
+              <w:t>constructionElements</w:t>
+            </w:r>
+            <w:r>
+              <w:rPr>
+                <w:lang w:val="en-US"/>
+              </w:rPr>
+              <w:t>.coatingType}. {/}</w:t>
+            </w:r>
+            <w:r>
+              <w:rPr>
+                <w:lang w:val="en-US"/>
+              </w:rPr>
+              <w:t>{</w:t>
+            </w:r>
+            <w:r>
+              <w:rPr>
+                <w:lang w:val="en-US"/>
+              </w:rPr>
+              <w:t>#</w:t>
+            </w:r>
+            <w:r>
+              <w:rPr>
+                <w:lang w:val="en-US"/>
+              </w:rPr>
+              <w:t>constructionElements</w:t>
+            </w:r>
+            <w:r>
+              <w:rPr>
+                <w:lang w:val="en-US"/>
+              </w:rPr>
+              <w:t>.coatingCondition</w:t>
+            </w:r>
+            <w:r>
+              <w:rPr>
+                <w:lang w:val="en-US"/>
+              </w:rPr>
+              <w:t>}</w:t>
+            </w:r>
+            <w:r>
+              <w:rPr>
+                <w:lang w:val="uk-UA"/>
+              </w:rPr>
+              <w:t xml:space="preserve">Стан </w:t>
+            </w:r>
+            <w:r>
+              <w:rPr>
+                <w:lang w:val="en-US"/>
+              </w:rPr>
+              <w:t>{</w:t>
+            </w:r>
+            <w:r>
+              <w:rPr>
+                <w:lang w:val="en-US"/>
+              </w:rPr>
+              <w:t>constructionElements</w:t>
+            </w:r>
+            <w:r>
+              <w:rPr>
+                <w:lang w:val="en-US"/>
+              </w:rPr>
               <w:t>.</w:t>
             </w:r>
             <w:r>
@@ -8115,126 +8156,6 @@
               <w:rPr>
                 <w:lang w:val="en-US"/>
               </w:rPr>
-              <w:t>Type</w:t>
-            </w:r>
-            <w:r>
-              <w:rPr>
-                <w:lang w:val="en-US"/>
-              </w:rPr>
-              <w:t>}</w:t>
-            </w:r>
-            <w:r>
-              <w:rPr>
-                <w:lang w:val="uk-UA"/>
-              </w:rPr>
-              <w:t xml:space="preserve">Тип: </w:t>
-            </w:r>
-            <w:r>
-              <w:rPr>
-                <w:lang w:val="en-US"/>
-              </w:rPr>
-              <w:t>{</w:t>
-            </w:r>
-            <w:r>
-              <w:rPr>
-                <w:lang w:val="en-US"/>
-              </w:rPr>
-              <w:t>constructionElements</w:t>
-            </w:r>
-            <w:r>
-              <w:rPr>
-                <w:lang w:val="en-US"/>
-              </w:rPr>
-              <w:t>.</w:t>
-            </w:r>
-            <w:r>
-              <w:rPr>
-                <w:lang w:val="en-US"/>
-              </w:rPr>
-              <w:t>coating</w:t>
-            </w:r>
-            <w:r>
-              <w:rPr>
-                <w:lang w:val="en-US"/>
-              </w:rPr>
-              <w:t>Type}. {/}</w:t>
-            </w:r>
-            <w:r>
-              <w:rPr>
-                <w:lang w:val="en-US"/>
-              </w:rPr>
-              <w:t>{</w:t>
-            </w:r>
-            <w:r>
-              <w:rPr>
-                <w:lang w:val="en-US"/>
-              </w:rPr>
-              <w:t>#</w:t>
-            </w:r>
-            <w:r>
-              <w:rPr>
-                <w:lang w:val="en-US"/>
-              </w:rPr>
-              <w:t>constructionElements</w:t>
-            </w:r>
-            <w:r>
-              <w:rPr>
-                <w:lang w:val="en-US"/>
-              </w:rPr>
-              <w:t>.</w:t>
-            </w:r>
-            <w:r>
-              <w:rPr>
-                <w:lang w:val="en-US"/>
-              </w:rPr>
-              <w:t>coating</w:t>
-            </w:r>
-            <w:r>
-              <w:rPr>
-                <w:lang w:val="en-US"/>
-              </w:rPr>
-              <w:t>Condition</w:t>
-            </w:r>
-            <w:r>
-              <w:rPr>
-                <w:lang w:val="en-US"/>
-              </w:rPr>
-              <w:t>}</w:t>
-            </w:r>
-            <w:r>
-              <w:rPr>
-                <w:lang w:val="uk-UA"/>
-              </w:rPr>
-              <w:t xml:space="preserve">Стан </w:t>
-            </w:r>
-            <w:r>
-              <w:rPr>
-                <w:lang w:val="en-US"/>
-              </w:rPr>
-              <w:t>{</w:t>
-            </w:r>
-            <w:r>
-              <w:rPr>
-                <w:lang w:val="en-US"/>
-              </w:rPr>
-              <w:t>constructionElements</w:t>
-            </w:r>
-            <w:r>
-              <w:rPr>
-                <w:lang w:val="en-US"/>
-              </w:rPr>
-              <w:t>.</w:t>
-            </w:r>
-            <w:r>
-              <w:rPr>
-                <w:lang w:val="en-US"/>
-              </w:rPr>
-              <w:t>coating</w:t>
-            </w:r>
-            <w:r>
-              <w:rPr>
-                <w:lang w:val="en-US"/>
-              </w:rPr>
               <w:t xml:space="preserve">Condition}.{/} </w:t>
             </w:r>
             <w:r>
@@ -8247,13 +8168,7 @@
               <w:rPr>
                 <w:lang w:val="en-US"/>
               </w:rPr>
-              <w:t>coating</w:t>
-            </w:r>
-            <w:r>
-              <w:rPr>
-                <w:lang w:val="en-US"/>
-              </w:rPr>
-              <w:t xml:space="preserve"> </w:t>
+              <w:t xml:space="preserve">coating </w:t>
             </w:r>
             <w:r>
               <w:rPr>
@@ -8353,19 +8268,7 @@
               <w:rPr>
                 <w:lang w:val="en-US"/>
               </w:rPr>
-              <w:t>.</w:t>
-            </w:r>
-            <w:r>
-              <w:rPr>
-                <w:lang w:val="en-US"/>
-              </w:rPr>
-              <w:t>stairs</w:t>
-            </w:r>
-            <w:r>
-              <w:rPr>
-                <w:lang w:val="en-US"/>
-              </w:rPr>
-              <w:t>Type</w:t>
+              <w:t>.stairsType</w:t>
             </w:r>
             <w:r>
               <w:rPr>
@@ -8395,19 +8298,7 @@
               <w:rPr>
                 <w:lang w:val="en-US"/>
               </w:rPr>
-              <w:t>.</w:t>
-            </w:r>
-            <w:r>
-              <w:rPr>
-                <w:lang w:val="en-US"/>
-              </w:rPr>
-              <w:t>stairs</w:t>
-            </w:r>
-            <w:r>
-              <w:rPr>
-                <w:lang w:val="en-US"/>
-              </w:rPr>
-              <w:t xml:space="preserve">Type}. </w:t>
+              <w:t xml:space="preserve">.stairsType}. </w:t>
             </w:r>
             <w:r>
               <w:rPr>
@@ -8531,19 +8422,7 @@
               <w:rPr>
                 <w:lang w:val="en-US"/>
               </w:rPr>
-              <w:t>.</w:t>
-            </w:r>
-            <w:r>
-              <w:rPr>
-                <w:lang w:val="en-US"/>
-              </w:rPr>
-              <w:t>roofing</w:t>
-            </w:r>
-            <w:r>
-              <w:rPr>
-                <w:lang w:val="en-US"/>
-              </w:rPr>
-              <w:t>Type</w:t>
+              <w:t>.roofingType</w:t>
             </w:r>
             <w:r>
               <w:rPr>
@@ -8573,19 +8452,7 @@
               <w:rPr>
                 <w:lang w:val="en-US"/>
               </w:rPr>
-              <w:t>.</w:t>
-            </w:r>
-            <w:r>
-              <w:rPr>
-                <w:lang w:val="en-US"/>
-              </w:rPr>
-              <w:t>roofing</w:t>
-            </w:r>
-            <w:r>
-              <w:rPr>
-                <w:lang w:val="en-US"/>
-              </w:rPr>
-              <w:t>Type}. {/}</w:t>
+              <w:t>.roofingType}. {/}</w:t>
             </w:r>
             <w:r>
               <w:rPr>
@@ -8609,19 +8476,7 @@
               <w:rPr>
                 <w:lang w:val="en-US"/>
               </w:rPr>
-              <w:t>.</w:t>
-            </w:r>
-            <w:r>
-              <w:rPr>
-                <w:lang w:val="en-US"/>
-              </w:rPr>
-              <w:t>roofing</w:t>
-            </w:r>
-            <w:r>
-              <w:rPr>
-                <w:lang w:val="en-US"/>
-              </w:rPr>
-              <w:t>Condition</w:t>
+              <w:t>.roofingCondition</w:t>
             </w:r>
             <w:r>
               <w:rPr>
@@ -8651,25 +8506,12 @@
               <w:rPr>
                 <w:lang w:val="en-US"/>
               </w:rPr>
-              <w:t>.</w:t>
-            </w:r>
-            <w:r>
-              <w:rPr>
-                <w:lang w:val="en-US"/>
-              </w:rPr>
-              <w:t>roofing</w:t>
-            </w:r>
-            <w:r>
-              <w:rPr>
-                <w:lang w:val="en-US"/>
-              </w:rPr>
-              <w:t xml:space="preserve">Condition}.{/} </w:t>
-            </w:r>
-            <w:r>
-              <w:rPr>
-                <w:lang w:val="en-US"/>
-              </w:rPr>
-              <w:lastRenderedPageBreak/>
+              <w:t xml:space="preserve">.roofingCondition}.{/} </w:t>
+            </w:r>
+            <w:r>
+              <w:rPr>
+                <w:lang w:val="en-US"/>
+              </w:rPr>
               <w:t>{</w:t>
             </w:r>
             <w:r>
@@ -8688,19 +8530,7 @@
               <w:rPr>
                 <w:lang w:val="en-US"/>
               </w:rPr>
-              <w:t>.</w:t>
-            </w:r>
-            <w:r>
-              <w:rPr>
-                <w:lang w:val="en-US"/>
-              </w:rPr>
-              <w:t>roofing</w:t>
-            </w:r>
-            <w:r>
-              <w:rPr>
-                <w:lang w:val="en-US"/>
-              </w:rPr>
-              <w:t>Defects</w:t>
+              <w:t>.roofingDefects</w:t>
             </w:r>
             <w:r>
               <w:rPr>
@@ -8730,19 +8560,7 @@
               <w:rPr>
                 <w:lang w:val="en-US"/>
               </w:rPr>
-              <w:t>.</w:t>
-            </w:r>
-            <w:r>
-              <w:rPr>
-                <w:lang w:val="en-US"/>
-              </w:rPr>
-              <w:t>roofing</w:t>
-            </w:r>
-            <w:r>
-              <w:rPr>
-                <w:lang w:val="en-US"/>
-              </w:rPr>
-              <w:t xml:space="preserve">Defects}.{/} </w:t>
+              <w:t xml:space="preserve">.roofingDefects}.{/} </w:t>
             </w:r>
             <w:r>
               <w:rPr>
@@ -8754,13 +8572,7 @@
               <w:rPr>
                 <w:lang w:val="en-US"/>
               </w:rPr>
-              <w:t>roofing</w:t>
-            </w:r>
-            <w:r>
-              <w:rPr>
-                <w:lang w:val="en-US"/>
-              </w:rPr>
-              <w:t xml:space="preserve"> </w:t>
+              <w:t xml:space="preserve">roofing </w:t>
             </w:r>
             <w:r>
               <w:rPr>
@@ -8797,7 +8609,6 @@
                 <w:szCs w:val="28"/>
                 <w:lang w:val="en-AU"/>
               </w:rPr>
-              <w:lastRenderedPageBreak/>
               <w:t>5.</w:t>
             </w:r>
           </w:p>
@@ -8861,19 +8672,7 @@
               <w:rPr>
                 <w:lang w:val="en-US"/>
               </w:rPr>
-              <w:t>.</w:t>
-            </w:r>
-            <w:r>
-              <w:rPr>
-                <w:lang w:val="en-US"/>
-              </w:rPr>
-              <w:t>partitions</w:t>
-            </w:r>
-            <w:r>
-              <w:rPr>
-                <w:lang w:val="en-US"/>
-              </w:rPr>
-              <w:t>Type</w:t>
+              <w:t>.partitionsType</w:t>
             </w:r>
             <w:r>
               <w:rPr>
@@ -8903,19 +8702,7 @@
               <w:rPr>
                 <w:lang w:val="en-US"/>
               </w:rPr>
-              <w:t>.</w:t>
-            </w:r>
-            <w:r>
-              <w:rPr>
-                <w:lang w:val="en-US"/>
-              </w:rPr>
-              <w:t>partitions</w:t>
-            </w:r>
-            <w:r>
-              <w:rPr>
-                <w:lang w:val="en-US"/>
-              </w:rPr>
-              <w:t>Type}. {/}</w:t>
+              <w:t>.partitionsType}. {/}</w:t>
             </w:r>
             <w:r>
               <w:rPr>
@@ -8939,19 +8726,7 @@
               <w:rPr>
                 <w:lang w:val="en-US"/>
               </w:rPr>
-              <w:t>.</w:t>
-            </w:r>
-            <w:r>
-              <w:rPr>
-                <w:lang w:val="en-US"/>
-              </w:rPr>
-              <w:t>partitions</w:t>
-            </w:r>
-            <w:r>
-              <w:rPr>
-                <w:lang w:val="en-US"/>
-              </w:rPr>
-              <w:t>Condition</w:t>
+              <w:t>.partitionsCondition</w:t>
             </w:r>
             <w:r>
               <w:rPr>
@@ -8981,19 +8756,7 @@
               <w:rPr>
                 <w:lang w:val="en-US"/>
               </w:rPr>
-              <w:t>.</w:t>
-            </w:r>
-            <w:r>
-              <w:rPr>
-                <w:lang w:val="en-US"/>
-              </w:rPr>
-              <w:t>partitions</w:t>
-            </w:r>
-            <w:r>
-              <w:rPr>
-                <w:lang w:val="en-US"/>
-              </w:rPr>
-              <w:t xml:space="preserve">Condition}.{/} </w:t>
+              <w:t xml:space="preserve">.partitionsCondition}.{/} </w:t>
             </w:r>
             <w:r>
               <w:rPr>
@@ -9017,19 +8780,7 @@
               <w:rPr>
                 <w:lang w:val="en-US"/>
               </w:rPr>
-              <w:t>.</w:t>
-            </w:r>
-            <w:r>
-              <w:rPr>
-                <w:lang w:val="en-US"/>
-              </w:rPr>
-              <w:t>partitions</w:t>
-            </w:r>
-            <w:r>
-              <w:rPr>
-                <w:lang w:val="en-US"/>
-              </w:rPr>
-              <w:t>Defects</w:t>
+              <w:t>.partitionsDefects</w:t>
             </w:r>
             <w:r>
               <w:rPr>
@@ -9059,19 +8810,7 @@
               <w:rPr>
                 <w:lang w:val="en-US"/>
               </w:rPr>
-              <w:t>.</w:t>
-            </w:r>
-            <w:r>
-              <w:rPr>
-                <w:lang w:val="en-US"/>
-              </w:rPr>
-              <w:t>partitions</w:t>
-            </w:r>
-            <w:r>
-              <w:rPr>
-                <w:lang w:val="en-US"/>
-              </w:rPr>
-              <w:t xml:space="preserve">Defects}.{/} </w:t>
+              <w:t xml:space="preserve">.partitionsDefects}.{/} </w:t>
             </w:r>
             <w:r>
               <w:rPr>
@@ -9083,13 +8822,7 @@
               <w:rPr>
                 <w:lang w:val="en-US"/>
               </w:rPr>
-              <w:t>partitions</w:t>
-            </w:r>
-            <w:r>
-              <w:rPr>
-                <w:lang w:val="en-US"/>
-              </w:rPr>
-              <w:t xml:space="preserve"> </w:t>
+              <w:t xml:space="preserve">partitions </w:t>
             </w:r>
             <w:r>
               <w:rPr>
@@ -9189,19 +8922,7 @@
               <w:rPr>
                 <w:lang w:val="en-US"/>
               </w:rPr>
-              <w:t>.</w:t>
-            </w:r>
-            <w:r>
-              <w:rPr>
-                <w:lang w:val="en-US"/>
-              </w:rPr>
-              <w:t>floor</w:t>
-            </w:r>
-            <w:r>
-              <w:rPr>
-                <w:lang w:val="en-US"/>
-              </w:rPr>
-              <w:t>Type</w:t>
+              <w:t>.floorType</w:t>
             </w:r>
             <w:r>
               <w:rPr>
@@ -9231,19 +8952,7 @@
               <w:rPr>
                 <w:lang w:val="en-US"/>
               </w:rPr>
-              <w:t>.</w:t>
-            </w:r>
-            <w:r>
-              <w:rPr>
-                <w:lang w:val="en-US"/>
-              </w:rPr>
-              <w:t>floor</w:t>
-            </w:r>
-            <w:r>
-              <w:rPr>
-                <w:lang w:val="en-US"/>
-              </w:rPr>
-              <w:t>Type}. {/}</w:t>
+              <w:t>.floorType}. {/}</w:t>
             </w:r>
             <w:r>
               <w:rPr>
@@ -9267,19 +8976,7 @@
               <w:rPr>
                 <w:lang w:val="en-US"/>
               </w:rPr>
-              <w:t>.</w:t>
-            </w:r>
-            <w:r>
-              <w:rPr>
-                <w:lang w:val="en-US"/>
-              </w:rPr>
-              <w:t>floor</w:t>
-            </w:r>
-            <w:r>
-              <w:rPr>
-                <w:lang w:val="en-US"/>
-              </w:rPr>
-              <w:t>Condition</w:t>
+              <w:t>.floorCondition</w:t>
             </w:r>
             <w:r>
               <w:rPr>
@@ -9309,19 +9006,7 @@
               <w:rPr>
                 <w:lang w:val="en-US"/>
               </w:rPr>
-              <w:t>.</w:t>
-            </w:r>
-            <w:r>
-              <w:rPr>
-                <w:lang w:val="en-US"/>
-              </w:rPr>
-              <w:t>floor</w:t>
-            </w:r>
-            <w:r>
-              <w:rPr>
-                <w:lang w:val="en-US"/>
-              </w:rPr>
-              <w:t xml:space="preserve">Condition}.{/} </w:t>
+              <w:t xml:space="preserve">.floorCondition}.{/} </w:t>
             </w:r>
             <w:r>
               <w:rPr>
@@ -9345,19 +9030,7 @@
               <w:rPr>
                 <w:lang w:val="en-US"/>
               </w:rPr>
-              <w:t>.</w:t>
-            </w:r>
-            <w:r>
-              <w:rPr>
-                <w:lang w:val="en-US"/>
-              </w:rPr>
-              <w:t>floor</w:t>
-            </w:r>
-            <w:r>
-              <w:rPr>
-                <w:lang w:val="en-US"/>
-              </w:rPr>
-              <w:t>Defects</w:t>
+              <w:t>.floorDefects</w:t>
             </w:r>
             <w:r>
               <w:rPr>
@@ -9387,19 +9060,7 @@
               <w:rPr>
                 <w:lang w:val="en-US"/>
               </w:rPr>
-              <w:t>.</w:t>
-            </w:r>
-            <w:r>
-              <w:rPr>
-                <w:lang w:val="en-US"/>
-              </w:rPr>
-              <w:t>floor</w:t>
-            </w:r>
-            <w:r>
-              <w:rPr>
-                <w:lang w:val="en-US"/>
-              </w:rPr>
-              <w:t xml:space="preserve">Defects}.{/} </w:t>
+              <w:t xml:space="preserve">.floorDefects}.{/} </w:t>
             </w:r>
             <w:r>
               <w:rPr>
@@ -9411,13 +9072,7 @@
               <w:rPr>
                 <w:lang w:val="en-US"/>
               </w:rPr>
-              <w:t>floor</w:t>
-            </w:r>
-            <w:r>
-              <w:rPr>
-                <w:lang w:val="en-US"/>
-              </w:rPr>
-              <w:t xml:space="preserve"> </w:t>
+              <w:t xml:space="preserve">floor </w:t>
             </w:r>
             <w:r>
               <w:rPr>
@@ -9709,7 +9364,6 @@
               <w:rPr>
                 <w:lang w:val="en-US"/>
               </w:rPr>
-              <w:lastRenderedPageBreak/>
               <w:t>{</w:t>
             </w:r>
             <w:r>
@@ -9789,7 +9443,6 @@
                 <w:szCs w:val="28"/>
                 <w:lang w:val="en-AU"/>
               </w:rPr>
-              <w:lastRenderedPageBreak/>
               <w:t>8.</w:t>
             </w:r>
           </w:p>
@@ -9853,19 +9506,7 @@
               <w:rPr>
                 <w:lang w:val="en-US"/>
               </w:rPr>
-              <w:t>.</w:t>
-            </w:r>
-            <w:r>
-              <w:rPr>
-                <w:lang w:val="en-US"/>
-              </w:rPr>
-              <w:t>facade</w:t>
-            </w:r>
-            <w:r>
-              <w:rPr>
-                <w:lang w:val="en-US"/>
-              </w:rPr>
-              <w:t>Type</w:t>
+              <w:t>.facadeType</w:t>
             </w:r>
             <w:r>
               <w:rPr>
@@ -9895,19 +9536,7 @@
               <w:rPr>
                 <w:lang w:val="en-US"/>
               </w:rPr>
-              <w:t>.</w:t>
-            </w:r>
-            <w:r>
-              <w:rPr>
-                <w:lang w:val="en-US"/>
-              </w:rPr>
-              <w:t>facade</w:t>
-            </w:r>
-            <w:r>
-              <w:rPr>
-                <w:lang w:val="en-US"/>
-              </w:rPr>
-              <w:t>Type}. {/}</w:t>
+              <w:t>.facadeType}. {/}</w:t>
             </w:r>
             <w:r>
               <w:rPr>
@@ -9931,19 +9560,7 @@
               <w:rPr>
                 <w:lang w:val="en-US"/>
               </w:rPr>
-              <w:t>.</w:t>
-            </w:r>
-            <w:r>
-              <w:rPr>
-                <w:lang w:val="en-US"/>
-              </w:rPr>
-              <w:t>facade</w:t>
-            </w:r>
-            <w:r>
-              <w:rPr>
-                <w:lang w:val="en-US"/>
-              </w:rPr>
-              <w:t>Condition</w:t>
+              <w:t>.facadeCondition</w:t>
             </w:r>
             <w:r>
               <w:rPr>
@@ -9973,19 +9590,7 @@
               <w:rPr>
                 <w:lang w:val="en-US"/>
               </w:rPr>
-              <w:t>.</w:t>
-            </w:r>
-            <w:r>
-              <w:rPr>
-                <w:lang w:val="en-US"/>
-              </w:rPr>
-              <w:t>facade</w:t>
-            </w:r>
-            <w:r>
-              <w:rPr>
-                <w:lang w:val="en-US"/>
-              </w:rPr>
-              <w:t xml:space="preserve">Condition}.{/} </w:t>
+              <w:t xml:space="preserve">.facadeCondition}.{/} </w:t>
             </w:r>
             <w:r>
               <w:rPr>
@@ -10009,19 +9614,7 @@
               <w:rPr>
                 <w:lang w:val="en-US"/>
               </w:rPr>
-              <w:t>.</w:t>
-            </w:r>
-            <w:r>
-              <w:rPr>
-                <w:lang w:val="en-US"/>
-              </w:rPr>
-              <w:t>facade</w:t>
-            </w:r>
-            <w:r>
-              <w:rPr>
-                <w:lang w:val="en-US"/>
-              </w:rPr>
-              <w:t>Defects</w:t>
+              <w:t>.facadeDefects</w:t>
             </w:r>
             <w:r>
               <w:rPr>
@@ -10051,19 +9644,7 @@
               <w:rPr>
                 <w:lang w:val="en-US"/>
               </w:rPr>
-              <w:t>.</w:t>
-            </w:r>
-            <w:r>
-              <w:rPr>
-                <w:lang w:val="en-US"/>
-              </w:rPr>
-              <w:t>facade</w:t>
-            </w:r>
-            <w:r>
-              <w:rPr>
-                <w:lang w:val="en-US"/>
-              </w:rPr>
-              <w:t xml:space="preserve">Defects}.{/} </w:t>
+              <w:t xml:space="preserve">.facadeDefects}.{/} </w:t>
             </w:r>
             <w:r>
               <w:rPr>
@@ -10075,13 +9656,7 @@
               <w:rPr>
                 <w:lang w:val="en-US"/>
               </w:rPr>
-              <w:t>facade</w:t>
-            </w:r>
-            <w:r>
-              <w:rPr>
-                <w:lang w:val="en-US"/>
-              </w:rPr>
-              <w:t xml:space="preserve"> </w:t>
+              <w:t xml:space="preserve">facade </w:t>
             </w:r>
             <w:r>
               <w:rPr>
@@ -10555,19 +10130,7 @@
               <w:rPr>
                 <w:lang w:val="en-US"/>
               </w:rPr>
-              <w:t xml:space="preserve"> </w:t>
-            </w:r>
-            <w:r>
-              <w:rPr>
-                <w:lang w:val="en-US"/>
-              </w:rPr>
-              <w:t>}. {/}</w:t>
-            </w:r>
-            <w:r>
-              <w:rPr>
-                <w:lang w:val="en-US"/>
-              </w:rPr>
-              <w:t xml:space="preserve"> </w:t>
+              <w:t xml:space="preserve"> }. {/} </w:t>
             </w:r>
             <w:r>
               <w:rPr>
@@ -10579,13 +10142,7 @@
               <w:rPr>
                 <w:lang w:val="en-US"/>
               </w:rPr>
-              <w:t>disabilitiesSupport</w:t>
-            </w:r>
-            <w:r>
-              <w:rPr>
-                <w:lang w:val="en-US"/>
-              </w:rPr>
-              <w:t xml:space="preserve"> </w:t>
+              <w:t xml:space="preserve">disabilitiesSupport </w:t>
             </w:r>
             <w:r>
               <w:rPr>
@@ -10738,20 +10295,13 @@
               <w:rPr>
                 <w:lang w:val="en-US"/>
               </w:rPr>
-              <w:lastRenderedPageBreak/>
               <w:t>{constructionElements.</w:t>
             </w:r>
             <w:r>
               <w:rPr>
                 <w:lang w:val="en-US"/>
               </w:rPr>
-              <w:t>D</w:t>
-            </w:r>
-            <w:r>
-              <w:rPr>
-                <w:lang w:val="en-US"/>
-              </w:rPr>
-              <w:t>efense</w:t>
+              <w:t>Defense</w:t>
             </w:r>
             <w:r>
               <w:rPr>
@@ -11067,13 +10617,7 @@
               <w:rPr>
                 <w:lang w:val="en-US"/>
               </w:rPr>
-              <w:t xml:space="preserve"> </w:t>
-            </w:r>
-            <w:r>
-              <w:rPr>
-                <w:lang w:val="en-US"/>
-              </w:rPr>
-              <w:t>internalSystems.coldWater</w:t>
+              <w:t xml:space="preserve"> internalSystems.coldWater</w:t>
             </w:r>
             <w:r>
               <w:rPr>
@@ -11103,13 +10647,7 @@
               <w:rPr>
                 <w:lang w:val="en-US"/>
               </w:rPr>
-              <w:t xml:space="preserve"> </w:t>
-            </w:r>
-            <w:r>
-              <w:rPr>
-                <w:lang w:val="en-US"/>
-              </w:rPr>
-              <w:t>internalSystems.coldWater</w:t>
+              <w:t xml:space="preserve"> internalSystems.coldWater</w:t>
             </w:r>
             <w:r>
               <w:rPr>
@@ -11585,13 +11123,7 @@
               <w:rPr>
                 <w:lang w:val="en-US"/>
               </w:rPr>
-              <w:t>drainage</w:t>
-            </w:r>
-            <w:r>
-              <w:rPr>
-                <w:lang w:val="en-US"/>
-              </w:rPr>
-              <w:t xml:space="preserve"> </w:t>
+              <w:t xml:space="preserve">drainage </w:t>
             </w:r>
             <w:r>
               <w:rPr>
@@ -11690,13 +11222,7 @@
               <w:rPr>
                 <w:lang w:val="en-US"/>
               </w:rPr>
-              <w:t>heating</w:t>
-            </w:r>
-            <w:r>
-              <w:rPr>
-                <w:lang w:val="en-US"/>
-              </w:rPr>
-              <w:t>Type</w:t>
+              <w:t>heatingType</w:t>
             </w:r>
             <w:r>
               <w:rPr>
@@ -11762,13 +11288,7 @@
               <w:rPr>
                 <w:lang w:val="en-US"/>
               </w:rPr>
-              <w:t>heating</w:t>
-            </w:r>
-            <w:r>
-              <w:rPr>
-                <w:lang w:val="en-US"/>
-              </w:rPr>
-              <w:t>Defects</w:t>
+              <w:t>heatingDefects</w:t>
             </w:r>
             <w:r>
               <w:rPr>
@@ -11786,7 +11306,6 @@
               <w:rPr>
                 <w:lang w:val="en-US"/>
               </w:rPr>
-              <w:lastRenderedPageBreak/>
               <w:t>{</w:t>
             </w:r>
             <w:r>
@@ -11799,13 +11318,7 @@
               <w:rPr>
                 <w:lang w:val="en-US"/>
               </w:rPr>
-              <w:t>heating</w:t>
-            </w:r>
-            <w:r>
-              <w:rPr>
-                <w:lang w:val="en-US"/>
-              </w:rPr>
-              <w:t xml:space="preserve">Defects}.{/} </w:t>
+              <w:t xml:space="preserve">heatingDefects}.{/} </w:t>
             </w:r>
             <w:r>
               <w:rPr>
@@ -11817,13 +11330,7 @@
               <w:rPr>
                 <w:lang w:val="en-US"/>
               </w:rPr>
-              <w:t>heating</w:t>
-            </w:r>
-            <w:r>
-              <w:rPr>
-                <w:lang w:val="en-US"/>
-              </w:rPr>
-              <w:t xml:space="preserve"> </w:t>
+              <w:t xml:space="preserve">heating </w:t>
             </w:r>
             <w:r>
               <w:rPr>
@@ -11860,7 +11367,6 @@
                 <w:szCs w:val="28"/>
                 <w:lang w:val="en-AU"/>
               </w:rPr>
-              <w:lastRenderedPageBreak/>
               <w:t>5.</w:t>
             </w:r>
           </w:p>
@@ -12144,13 +11650,7 @@
               <w:rPr>
                 <w:lang w:val="en-US"/>
               </w:rPr>
-              <w:t>gas</w:t>
-            </w:r>
-            <w:r>
-              <w:rPr>
-                <w:lang w:val="en-US"/>
-              </w:rPr>
-              <w:t>Type</w:t>
+              <w:t>gasType</w:t>
             </w:r>
             <w:r>
               <w:rPr>
@@ -12364,13 +11864,7 @@
               <w:rPr>
                 <w:lang w:val="en-US"/>
               </w:rPr>
-              <w:t>ventilation</w:t>
-            </w:r>
-            <w:r>
-              <w:rPr>
-                <w:lang w:val="en-US"/>
-              </w:rPr>
-              <w:t>Type</w:t>
+              <w:t>ventilationType</w:t>
             </w:r>
             <w:r>
               <w:rPr>
@@ -12704,7 +12198,6 @@
               <w:rPr>
                 <w:lang w:val="en-US"/>
               </w:rPr>
-              <w:lastRenderedPageBreak/>
               <w:t>Defects</w:t>
             </w:r>
             <w:r>
@@ -12787,7 +12280,6 @@
                 <w:szCs w:val="28"/>
                 <w:lang w:val="en-AU"/>
               </w:rPr>
-              <w:lastRenderedPageBreak/>
               <w:t>9.</w:t>
             </w:r>
           </w:p>
@@ -13741,7 +13233,6 @@
         <w:rPr>
           <w:lang w:val="uk-UA"/>
         </w:rPr>
-        <w:lastRenderedPageBreak/>
         <w:t>Загальні відомості про об’єкт:</w:t>
       </w:r>
     </w:p>
@@ -15888,7 +15379,6 @@
         <w:rPr>
           <w:lang w:val="uk-UA"/>
         </w:rPr>
-        <w:lastRenderedPageBreak/>
         <w:t>-</w:t>
       </w:r>
       <w:r>
@@ -16753,13 +16243,7 @@
               <w:rPr>
                 <w:lang w:val="en-US"/>
               </w:rPr>
-              <w:t>heating</w:t>
-            </w:r>
-            <w:r>
-              <w:rPr>
-                <w:lang w:val="en-US"/>
-              </w:rPr>
-              <w:t>Type</w:t>
+              <w:t>heatingType</w:t>
             </w:r>
             <w:r>
               <w:rPr>
@@ -16789,13 +16273,7 @@
               <w:rPr>
                 <w:lang w:val="en-US"/>
               </w:rPr>
-              <w:t>heating</w:t>
-            </w:r>
-            <w:r>
-              <w:rPr>
-                <w:lang w:val="en-US"/>
-              </w:rPr>
-              <w:t>Type}. {/}</w:t>
+              <w:t>heatingType}. {/}</w:t>
             </w:r>
             <w:r>
               <w:rPr>
@@ -16819,13 +16297,7 @@
               <w:rPr>
                 <w:lang w:val="en-US"/>
               </w:rPr>
-              <w:t>heating</w:t>
-            </w:r>
-            <w:r>
-              <w:rPr>
-                <w:lang w:val="en-US"/>
-              </w:rPr>
-              <w:t>Condition</w:t>
+              <w:t>heatingCondition</w:t>
             </w:r>
             <w:r>
               <w:rPr>
@@ -16855,13 +16327,7 @@
               <w:rPr>
                 <w:lang w:val="en-US"/>
               </w:rPr>
-              <w:t>heating</w:t>
-            </w:r>
-            <w:r>
-              <w:rPr>
-                <w:lang w:val="en-US"/>
-              </w:rPr>
-              <w:t xml:space="preserve">Condition}.{/} </w:t>
+              <w:t xml:space="preserve">heatingCondition}.{/} </w:t>
             </w:r>
             <w:r>
               <w:rPr>
@@ -16885,13 +16351,7 @@
               <w:rPr>
                 <w:lang w:val="en-US"/>
               </w:rPr>
-              <w:t>heating</w:t>
-            </w:r>
-            <w:r>
-              <w:rPr>
-                <w:lang w:val="en-US"/>
-              </w:rPr>
-              <w:t>Defects</w:t>
+              <w:t>heatingDefects</w:t>
             </w:r>
             <w:r>
               <w:rPr>
@@ -16921,13 +16381,7 @@
               <w:rPr>
                 <w:lang w:val="en-US"/>
               </w:rPr>
-              <w:t>heating</w:t>
-            </w:r>
-            <w:r>
-              <w:rPr>
-                <w:lang w:val="en-US"/>
-              </w:rPr>
-              <w:t xml:space="preserve">Defects}.{/} </w:t>
+              <w:t xml:space="preserve">heatingDefects}.{/} </w:t>
             </w:r>
             <w:r>
               <w:rPr>
@@ -17006,16 +16460,7 @@
                 <w:szCs w:val="28"/>
                 <w:lang w:val="ru-RU"/>
               </w:rPr>
-              <w:t xml:space="preserve">Система водопостачання (обладнання безперебійно функціонуючою системою водопостачання (крім </w:t>
-            </w:r>
-            <w:r>
-              <w:rPr>
-                <w:noProof/>
-                <w:szCs w:val="28"/>
-                <w:lang w:val="ru-RU"/>
-              </w:rPr>
-              <w:lastRenderedPageBreak/>
-              <w:t>випадків аварійного або планового відключення)</w:t>
+              <w:t>Система водопостачання (обладнання безперебійно функціонуючою системою водопостачання (крім випадків аварійного або планового відключення)</w:t>
             </w:r>
           </w:p>
         </w:tc>
@@ -17035,7 +16480,6 @@
               <w:rPr>
                 <w:lang w:val="en-US"/>
               </w:rPr>
-              <w:lastRenderedPageBreak/>
               <w:t>{</w:t>
             </w:r>
             <w:r>
@@ -17138,14 +16582,7 @@
               <w:rPr>
                 <w:lang w:val="en-US"/>
               </w:rPr>
-              <w:t>Su</w:t>
-            </w:r>
-            <w:r>
-              <w:rPr>
-                <w:lang w:val="en-US"/>
-              </w:rPr>
-              <w:lastRenderedPageBreak/>
-              <w:t>pply</w:t>
+              <w:t>Supply</w:t>
             </w:r>
             <w:r>
               <w:rPr>
@@ -17271,13 +16708,7 @@
               <w:rPr>
                 <w:lang w:val="en-US"/>
               </w:rPr>
-              <w:t>Defects}.{/}</w:t>
-            </w:r>
-            <w:r>
-              <w:rPr>
-                <w:lang w:val="en-US"/>
-              </w:rPr>
-              <w:t xml:space="preserve"> </w:t>
+              <w:t xml:space="preserve">Defects}.{/} </w:t>
             </w:r>
             <w:r>
               <w:rPr>
@@ -17332,7 +16763,6 @@
                 <w:szCs w:val="28"/>
                 <w:lang w:val="en-AU"/>
               </w:rPr>
-              <w:lastRenderedPageBreak/>
               <w:t>4.</w:t>
             </w:r>
           </w:p>
@@ -17960,7 +17390,6 @@
         <w:pStyle w:val="CustomTitle"/>
       </w:pPr>
       <w:r>
-        <w:lastRenderedPageBreak/>
         <w:t>{/}</w:t>
       </w:r>
       <w:r>
@@ -19796,15 +19225,7 @@
                 <w:noProof/>
                 <w:lang w:val="en-US"/>
               </w:rPr>
-              <w:t xml:space="preserve">{givenName | firstLetter}. </w:t>
-            </w:r>
-            <w:r>
-              <w:rPr>
-                <w:noProof/>
-                <w:lang w:val="en-US"/>
-              </w:rPr>
-              <w:lastRenderedPageBreak/>
-              <w:t>{additionalName | firstLetter}</w:t>
+              <w:t>{givenName | firstLetter}. {additionalName | firstLetter}</w:t>
             </w:r>
             <w:r>
               <w:rPr>
@@ -19846,7 +19267,6 @@
               </w:rPr>
             </w:pPr>
             <w:r>
-              <w:lastRenderedPageBreak/>
               <w:t>(підпис)</w:t>
             </w:r>
           </w:p>
@@ -21056,6 +20476,60 @@
       <w:lang w:val="ru-RU" w:eastAsia="uk-UA"/>
     </w:rPr>
   </w:style>
+  <w:style w:type="paragraph" w:styleId="Footer">
+    <w:name w:val="footer"/>
+    <w:basedOn w:val="Normal"/>
+    <w:link w:val="FooterChar"/>
+    <w:uiPriority w:val="99"/>
+    <w:unhideWhenUsed/>
+    <w:rsid w:val="00EA144F"/>
+    <w:pPr>
+      <w:tabs>
+        <w:tab w:val="center" w:pos="4680"/>
+        <w:tab w:val="right" w:pos="9360"/>
+      </w:tabs>
+    </w:pPr>
+  </w:style>
+  <w:style w:type="character" w:customStyle="1" w:styleId="FooterChar">
+    <w:name w:val="Footer Char"/>
+    <w:basedOn w:val="DefaultParagraphFont"/>
+    <w:link w:val="Footer"/>
+    <w:uiPriority w:val="99"/>
+    <w:rsid w:val="00EA144F"/>
+    <w:rPr>
+      <w:rFonts w:ascii="Times New Roman" w:eastAsia="Times New Roman" w:hAnsi="Times New Roman" w:cs="Times New Roman"/>
+      <w:sz w:val="28"/>
+      <w:szCs w:val="20"/>
+      <w:lang w:eastAsia="uk-UA"/>
+    </w:rPr>
+  </w:style>
+  <w:style w:type="paragraph" w:styleId="Header">
+    <w:name w:val="header"/>
+    <w:basedOn w:val="Normal"/>
+    <w:link w:val="HeaderChar"/>
+    <w:uiPriority w:val="99"/>
+    <w:unhideWhenUsed/>
+    <w:rsid w:val="00EA144F"/>
+    <w:pPr>
+      <w:tabs>
+        <w:tab w:val="center" w:pos="4680"/>
+        <w:tab w:val="right" w:pos="9360"/>
+      </w:tabs>
+    </w:pPr>
+  </w:style>
+  <w:style w:type="character" w:customStyle="1" w:styleId="HeaderChar">
+    <w:name w:val="Header Char"/>
+    <w:basedOn w:val="DefaultParagraphFont"/>
+    <w:link w:val="Header"/>
+    <w:uiPriority w:val="99"/>
+    <w:rsid w:val="00EA144F"/>
+    <w:rPr>
+      <w:rFonts w:ascii="Times New Roman" w:eastAsia="Times New Roman" w:hAnsi="Times New Roman" w:cs="Times New Roman"/>
+      <w:sz w:val="28"/>
+      <w:szCs w:val="20"/>
+      <w:lang w:eastAsia="uk-UA"/>
+    </w:rPr>
+  </w:style>
 </w:styles>
 </file>
 

</xml_diff>

<commit_message>
Type of ownership is added
</commit_message>
<xml_diff>
--- a/src/templates/act.docx
+++ b/src/templates/act.docx
@@ -1094,6 +1094,200 @@
       </w:r>
       <w:r>
         <w:rPr>
+          <w:rStyle w:val="Highlighted-boldChar"/>
+          <w:lang w:val="en-US"/>
+        </w:rPr>
+        <w:t>owner</w:t>
+      </w:r>
+      <w:r>
+        <w:rPr>
+          <w:rStyle w:val="Highlighted-boldChar"/>
+          <w:lang w:val="en-US"/>
+        </w:rPr>
+        <w:t>ship</w:t>
+      </w:r>
+      <w:r>
+        <w:rPr>
+          <w:rStyle w:val="Highlighted-boldChar"/>
+          <w:lang w:val="en-US"/>
+        </w:rPr>
+        <w:t>Type</w:t>
+      </w:r>
+      <w:r>
+        <w:rPr>
+          <w:lang w:val="uk-UA"/>
+        </w:rPr>
+        <w:t>}</w:t>
+      </w:r>
+      <w:r>
+        <w:rPr>
+          <w:rStyle w:val="Highlighted-boldChar"/>
+          <w:lang w:val="uk-UA"/>
+        </w:rPr>
+        <w:t xml:space="preserve"> (</w:t>
+      </w:r>
+      <w:r>
+        <w:rPr>
+          <w:rStyle w:val="Highlighted-boldChar"/>
+          <w:lang w:val="uk-UA"/>
+        </w:rPr>
+        <w:t>{</w:t>
+      </w:r>
+      <w:r>
+        <w:rPr>
+          <w:rStyle w:val="Highlighted-boldChar"/>
+          <w:lang w:val="en-US"/>
+        </w:rPr>
+        <w:t>owner</w:t>
+      </w:r>
+      <w:r>
+        <w:rPr>
+          <w:rStyle w:val="Highlighted-boldChar"/>
+          <w:lang w:val="en-US"/>
+        </w:rPr>
+        <w:t>ship</w:t>
+      </w:r>
+      <w:r>
+        <w:rPr>
+          <w:rStyle w:val="Highlighted-boldChar"/>
+          <w:lang w:val="en-US"/>
+        </w:rPr>
+        <w:t>Type</w:t>
+      </w:r>
+      <w:r>
+        <w:rPr>
+          <w:rStyle w:val="Highlighted-boldChar"/>
+          <w:lang w:val="uk-UA"/>
+        </w:rPr>
+        <w:t xml:space="preserve"> | </w:t>
+      </w:r>
+      <w:r>
+        <w:rPr>
+          <w:rStyle w:val="Highlighted-boldChar"/>
+          <w:lang w:val="en-US"/>
+        </w:rPr>
+        <w:t>toLowerCase</w:t>
+      </w:r>
+      <w:r>
+        <w:rPr>
+          <w:rStyle w:val="Highlighted-boldChar"/>
+          <w:lang w:val="uk-UA"/>
+        </w:rPr>
+        <w:t>}</w:t>
+      </w:r>
+      <w:r>
+        <w:rPr>
+          <w:rStyle w:val="Highlighted-boldChar"/>
+          <w:lang w:val="uk-UA"/>
+        </w:rPr>
+        <w:t>)</w:t>
+      </w:r>
+      <w:r>
+        <w:rPr>
+          <w:rStyle w:val="Highlighted-boldChar"/>
+          <w:lang w:val="uk-UA"/>
+        </w:rPr>
+        <w:t xml:space="preserve"> </w:t>
+      </w:r>
+      <w:r>
+        <w:rPr>
+          <w:rStyle w:val="Highlighted-boldChar"/>
+          <w:lang w:val="uk-UA"/>
+        </w:rPr>
+        <w:t>{/}</w:t>
+      </w:r>
+      <w:r>
+        <w:rPr>
+          <w:rStyle w:val="AlertChar"/>
+          <w:lang w:val="uk-UA"/>
+        </w:rPr>
+        <w:t>{#!</w:t>
+      </w:r>
+      <w:r>
+        <w:rPr>
+          <w:rStyle w:val="AlertChar"/>
+          <w:lang w:val="en-US"/>
+        </w:rPr>
+        <w:t>owner</w:t>
+      </w:r>
+      <w:r>
+        <w:rPr>
+          <w:rStyle w:val="AlertChar"/>
+          <w:lang w:val="en-US"/>
+        </w:rPr>
+        <w:t>ship</w:t>
+      </w:r>
+      <w:r>
+        <w:rPr>
+          <w:rStyle w:val="AlertChar"/>
+          <w:lang w:val="en-US"/>
+        </w:rPr>
+        <w:t>Type</w:t>
+      </w:r>
+      <w:r>
+        <w:rPr>
+          <w:rStyle w:val="AlertChar"/>
+          <w:lang w:val="uk-UA"/>
+        </w:rPr>
+        <w:t>}</w:t>
+      </w:r>
+      <w:r>
+        <w:rPr>
+          <w:rStyle w:val="AlertChar"/>
+          <w:lang w:val="uk-UA"/>
+        </w:rPr>
+        <w:t xml:space="preserve"> (</w:t>
+      </w:r>
+      <w:r>
+        <w:rPr>
+          <w:rStyle w:val="AlertChar"/>
+          <w:lang w:val="uk-UA"/>
+        </w:rPr>
+        <w:t xml:space="preserve">тип </w:t>
+      </w:r>
+      <w:r>
+        <w:rPr>
+          <w:rStyle w:val="AlertChar"/>
+          <w:lang w:val="uk-UA"/>
+        </w:rPr>
+        <w:t>власн</w:t>
+      </w:r>
+      <w:r>
+        <w:rPr>
+          <w:rStyle w:val="AlertChar"/>
+          <w:lang w:val="uk-UA"/>
+        </w:rPr>
+        <w:t>ості</w:t>
+      </w:r>
+      <w:r>
+        <w:rPr>
+          <w:rStyle w:val="AlertChar"/>
+          <w:lang w:val="uk-UA"/>
+        </w:rPr>
+        <w:t xml:space="preserve"> не визначено</w:t>
+      </w:r>
+      <w:r>
+        <w:rPr>
+          <w:rStyle w:val="AlertChar"/>
+          <w:lang w:val="uk-UA"/>
+        </w:rPr>
+        <w:t>)</w:t>
+      </w:r>
+      <w:r>
+        <w:rPr>
+          <w:rStyle w:val="AlertChar"/>
+          <w:lang w:val="uk-UA"/>
+        </w:rPr>
+        <w:t>{/}</w:t>
+      </w:r>
+      <w:r>
+        <w:rPr>
+          <w:lang w:val="uk-UA"/>
+        </w:rPr>
+        <w:t>{#</w:t>
+      </w:r>
+      <w:r>
+        <w:rPr>
           <w:lang w:val="en-US"/>
         </w:rPr>
         <w:t>ownerPerson</w:t>
@@ -1590,6 +1784,7 @@
         <w:rPr>
           <w:lang w:val="uk-UA"/>
         </w:rPr>
+        <w:lastRenderedPageBreak/>
         <w:t>Загальні відомості про об’єкт:</w:t>
       </w:r>
     </w:p>
@@ -1604,7 +1799,6 @@
         <w:rPr>
           <w:lang w:val="uk-UA"/>
         </w:rPr>
-        <w:lastRenderedPageBreak/>
         <w:t>місцезнаходження об’єкта (село, селище, місто, район, область, інші реквізити адреси</w:t>
       </w:r>
       <w:r>
@@ -3594,6 +3788,7 @@
           <w:rStyle w:val="Highlighted-boldChar"/>
           <w:lang w:val="uk-UA"/>
         </w:rPr>
+        <w:lastRenderedPageBreak/>
         <w:t>{</w:t>
       </w:r>
       <w:r>
@@ -3699,7 +3894,6 @@
         <w:rPr>
           <w:rStyle w:val="Highlighted-boldChar"/>
         </w:rPr>
-        <w:lastRenderedPageBreak/>
         <w:t>formatDate</w:t>
       </w:r>
       <w:r>
@@ -19823,77 +20017,7 @@
                 <w:noProof/>
                 <w:lang w:val="en-US"/>
               </w:rPr>
-              <w:t>}{/}</w:t>
-            </w:r>
-            <w:r>
-              <w:rPr>
-                <w:noProof/>
-                <w:lang w:val="en-US"/>
-              </w:rPr>
-              <w:t>{#</w:t>
-            </w:r>
-            <w:r>
-              <w:rPr>
-                <w:noProof/>
-                <w:lang w:val="en-US"/>
-              </w:rPr>
-              <w:t>organization</w:t>
-            </w:r>
-            <w:r>
-              <w:rPr>
-                <w:noProof/>
-                <w:lang w:val="en-US"/>
-              </w:rPr>
-              <w:t>}</w:t>
-            </w:r>
-            <w:r>
-              <w:rPr>
-                <w:noProof/>
-                <w:lang w:val="en-US"/>
-              </w:rPr>
-              <w:t>, {</w:t>
-            </w:r>
-            <w:r>
-              <w:rPr>
-                <w:noProof/>
-                <w:lang w:val="en-US"/>
-              </w:rPr>
-              <w:t>organization</w:t>
-            </w:r>
-            <w:r>
-              <w:rPr>
-                <w:noProof/>
-                <w:lang w:val="en-US"/>
-              </w:rPr>
-              <w:t>.title}{#</w:t>
-            </w:r>
-            <w:r>
-              <w:rPr>
-                <w:noProof/>
-                <w:lang w:val="en-US"/>
-              </w:rPr>
-              <w:t>organization.</w:t>
-            </w:r>
-            <w:r>
-              <w:rPr>
-                <w:noProof/>
-                <w:lang w:val="en-US"/>
-              </w:rPr>
-              <w:t>code} (</w:t>
-            </w:r>
-            <w:r>
-              <w:rPr>
-                <w:noProof/>
-                <w:lang w:val="en-US"/>
-              </w:rPr>
-              <w:t>{organization.code}</w:t>
-            </w:r>
-            <w:r>
-              <w:rPr>
-                <w:noProof/>
-                <w:lang w:val="en-US"/>
-              </w:rPr>
-              <w:t>){/}{/}</w:t>
+              <w:t>}{/}{#organization}, {organization.title}{#organization.code} ({organization.code}){/}{/}</w:t>
             </w:r>
           </w:p>
         </w:tc>

</xml_diff>

<commit_message>
Data validation is added
</commit_message>
<xml_diff>
--- a/src/templates/act.docx
+++ b/src/templates/act.docx
@@ -32,7 +32,7 @@
               <w:rPr>
                 <w:noProof/>
                 <w:szCs w:val="28"/>
-                <w:lang w:val="ru-RU"/>
+                <w:lang w:val="en-US"/>
               </w:rPr>
             </w:pPr>
           </w:p>
@@ -1208,569 +1208,594 @@
           <w:rStyle w:val="AlertChar"/>
           <w:lang w:val="en-US"/>
         </w:rPr>
-        <w:t>owner</w:t>
+        <w:t>ownershipType</w:t>
       </w:r>
       <w:r>
         <w:rPr>
           <w:rStyle w:val="AlertChar"/>
-          <w:lang w:val="en-US"/>
-        </w:rPr>
-        <w:t>ship</w:t>
+          <w:lang w:val="uk-UA"/>
+        </w:rPr>
+        <w:t>}</w:t>
       </w:r>
       <w:r>
         <w:rPr>
           <w:rStyle w:val="AlertChar"/>
-          <w:lang w:val="en-US"/>
-        </w:rPr>
-        <w:t>Type</w:t>
+          <w:lang w:val="uk-UA"/>
+        </w:rPr>
+        <w:t xml:space="preserve"> (</w:t>
       </w:r>
       <w:r>
         <w:rPr>
           <w:rStyle w:val="AlertChar"/>
           <w:lang w:val="uk-UA"/>
         </w:rPr>
+        <w:t>тип власності не визначено</w:t>
+      </w:r>
+      <w:r>
+        <w:rPr>
+          <w:rStyle w:val="AlertChar"/>
+          <w:lang w:val="uk-UA"/>
+        </w:rPr>
+        <w:t>)</w:t>
+      </w:r>
+      <w:r>
+        <w:rPr>
+          <w:rStyle w:val="AlertChar"/>
+          <w:lang w:val="uk-UA"/>
+        </w:rPr>
+        <w:t>{/}</w:t>
+      </w:r>
+      <w:r>
+        <w:rPr>
+          <w:lang w:val="uk-UA"/>
+        </w:rPr>
+        <w:t>{#</w:t>
+      </w:r>
+      <w:r>
+        <w:rPr>
+          <w:lang w:val="en-US"/>
+        </w:rPr>
+        <w:t>ownerPerson</w:t>
+      </w:r>
+      <w:r>
+        <w:rPr>
+          <w:lang w:val="uk-UA"/>
+        </w:rPr>
+        <w:t>.</w:t>
+      </w:r>
+      <w:r>
+        <w:rPr>
+          <w:lang w:val="en-US"/>
+        </w:rPr>
+        <w:t>family</w:t>
+      </w:r>
+      <w:r>
+        <w:rPr>
+          <w:lang w:val="en-US"/>
+        </w:rPr>
+        <w:t>Name</w:t>
+      </w:r>
+      <w:r>
+        <w:rPr>
+          <w:lang w:val="uk-UA"/>
+        </w:rPr>
         <w:t>}</w:t>
       </w:r>
       <w:r>
         <w:rPr>
-          <w:rStyle w:val="AlertChar"/>
-          <w:lang w:val="uk-UA"/>
-        </w:rPr>
-        <w:t xml:space="preserve"> (</w:t>
-      </w:r>
-      <w:r>
-        <w:rPr>
-          <w:rStyle w:val="AlertChar"/>
-          <w:lang w:val="uk-UA"/>
-        </w:rPr>
-        <w:t xml:space="preserve">тип </w:t>
-      </w:r>
-      <w:r>
-        <w:rPr>
-          <w:rStyle w:val="AlertChar"/>
-          <w:lang w:val="uk-UA"/>
-        </w:rPr>
-        <w:t>власн</w:t>
-      </w:r>
-      <w:r>
-        <w:rPr>
-          <w:rStyle w:val="AlertChar"/>
-          <w:lang w:val="uk-UA"/>
-        </w:rPr>
-        <w:t>ості</w:t>
-      </w:r>
-      <w:r>
-        <w:rPr>
-          <w:rStyle w:val="AlertChar"/>
-          <w:lang w:val="uk-UA"/>
-        </w:rPr>
-        <w:t xml:space="preserve"> не визначено</w:t>
-      </w:r>
-      <w:r>
-        <w:rPr>
-          <w:rStyle w:val="AlertChar"/>
+          <w:lang w:val="uk-UA"/>
+        </w:rPr>
+        <w:t xml:space="preserve">, </w:t>
+      </w:r>
+      <w:r>
+        <w:rPr>
+          <w:rStyle w:val="Highlighted-boldChar"/>
+          <w:lang w:val="uk-UA"/>
+        </w:rPr>
+        <w:t>{</w:t>
+      </w:r>
+      <w:r>
+        <w:rPr>
+          <w:rStyle w:val="Highlighted-boldChar"/>
+          <w:lang w:val="en-US"/>
+        </w:rPr>
+        <w:t>ownerPerson</w:t>
+      </w:r>
+      <w:r>
+        <w:rPr>
+          <w:rStyle w:val="Highlighted-boldChar"/>
+          <w:lang w:val="uk-UA"/>
+        </w:rPr>
+        <w:t>.</w:t>
+      </w:r>
+      <w:r>
+        <w:rPr>
+          <w:rStyle w:val="Highlighted-boldChar"/>
+          <w:lang w:val="en-US"/>
+        </w:rPr>
+        <w:t>familyName</w:t>
+      </w:r>
+      <w:r>
+        <w:rPr>
+          <w:rStyle w:val="Highlighted-boldChar"/>
+          <w:lang w:val="uk-UA"/>
+        </w:rPr>
+        <w:t>} {</w:t>
+      </w:r>
+      <w:r>
+        <w:rPr>
+          <w:rStyle w:val="Highlighted-boldChar"/>
+          <w:lang w:val="en-US"/>
+        </w:rPr>
+        <w:t>ownerPerson</w:t>
+      </w:r>
+      <w:r>
+        <w:rPr>
+          <w:rStyle w:val="Highlighted-boldChar"/>
+          <w:lang w:val="uk-UA"/>
+        </w:rPr>
+        <w:t>.</w:t>
+      </w:r>
+      <w:r>
+        <w:rPr>
+          <w:rStyle w:val="Highlighted-boldChar"/>
+          <w:lang w:val="en-US"/>
+        </w:rPr>
+        <w:t>givenName</w:t>
+      </w:r>
+      <w:r>
+        <w:rPr>
+          <w:rStyle w:val="Highlighted-boldChar"/>
+          <w:lang w:val="uk-UA"/>
+        </w:rPr>
+        <w:t xml:space="preserve"> | </w:t>
+      </w:r>
+      <w:r>
+        <w:rPr>
+          <w:rStyle w:val="Highlighted-boldChar"/>
+          <w:lang w:val="en-US"/>
+        </w:rPr>
+        <w:t>safe</w:t>
+      </w:r>
+      <w:r>
+        <w:rPr>
+          <w:rStyle w:val="Highlighted-boldChar"/>
+          <w:lang w:val="uk-UA"/>
+        </w:rPr>
+        <w:t>} {</w:t>
+      </w:r>
+      <w:r>
+        <w:rPr>
+          <w:rStyle w:val="Highlighted-boldChar"/>
+          <w:lang w:val="en-US"/>
+        </w:rPr>
+        <w:t>ownerPerson</w:t>
+      </w:r>
+      <w:r>
+        <w:rPr>
+          <w:rStyle w:val="Highlighted-boldChar"/>
+          <w:lang w:val="uk-UA"/>
+        </w:rPr>
+        <w:t>.</w:t>
+      </w:r>
+      <w:r>
+        <w:rPr>
+          <w:rStyle w:val="Highlighted-boldChar"/>
+          <w:lang w:val="en-US"/>
+        </w:rPr>
+        <w:t>additionalName</w:t>
+      </w:r>
+      <w:r>
+        <w:rPr>
+          <w:rStyle w:val="Highlighted-boldChar"/>
+          <w:lang w:val="uk-UA"/>
+        </w:rPr>
+        <w:t xml:space="preserve"> | </w:t>
+      </w:r>
+      <w:r>
+        <w:rPr>
+          <w:rStyle w:val="Highlighted-boldChar"/>
+          <w:lang w:val="en-US"/>
+        </w:rPr>
+        <w:t>safe</w:t>
+      </w:r>
+      <w:r>
+        <w:rPr>
+          <w:rStyle w:val="Highlighted-boldChar"/>
+          <w:lang w:val="uk-UA"/>
+        </w:rPr>
+        <w:t>}</w:t>
+      </w:r>
+      <w:r>
+        <w:rPr>
+          <w:lang w:val="uk-UA"/>
+        </w:rPr>
+        <w:t xml:space="preserve"> </w:t>
+      </w:r>
+      <w:r>
+        <w:rPr>
+          <w:lang w:val="uk-UA"/>
+        </w:rPr>
+        <w:t>{#</w:t>
+      </w:r>
+      <w:r>
+        <w:rPr>
+          <w:lang w:val="en-US"/>
+        </w:rPr>
+        <w:t>ownerPerson</w:t>
+      </w:r>
+      <w:r>
+        <w:rPr>
+          <w:lang w:val="uk-UA"/>
+        </w:rPr>
+        <w:t>.</w:t>
+      </w:r>
+      <w:r>
+        <w:rPr>
+          <w:lang w:val="en-US"/>
+        </w:rPr>
+        <w:t>taxId</w:t>
+      </w:r>
+      <w:r>
+        <w:rPr>
+          <w:lang w:val="uk-UA"/>
+        </w:rPr>
+        <w:t xml:space="preserve">}, </w:t>
+      </w:r>
+      <w:r>
+        <w:rPr>
+          <w:rStyle w:val="Highlighted-boldChar"/>
+          <w:lang w:val="uk-UA"/>
+        </w:rPr>
+        <w:t>РНОКПП – {</w:t>
+      </w:r>
+      <w:r>
+        <w:rPr>
+          <w:rStyle w:val="Highlighted-boldChar"/>
+          <w:lang w:val="en-US"/>
+        </w:rPr>
+        <w:t>ownerPerson</w:t>
+      </w:r>
+      <w:r>
+        <w:rPr>
+          <w:rStyle w:val="Highlighted-boldChar"/>
+          <w:lang w:val="uk-UA"/>
+        </w:rPr>
+        <w:t>.</w:t>
+      </w:r>
+      <w:r>
+        <w:rPr>
+          <w:rStyle w:val="Highlighted-boldChar"/>
+          <w:lang w:val="en-US"/>
+        </w:rPr>
+        <w:t>taxId</w:t>
+      </w:r>
+      <w:r>
+        <w:rPr>
+          <w:rStyle w:val="Highlighted-boldChar"/>
+          <w:lang w:val="uk-UA"/>
+        </w:rPr>
+        <w:t>}</w:t>
+      </w:r>
+      <w:r>
+        <w:rPr>
+          <w:lang w:val="uk-UA"/>
+        </w:rPr>
+        <w:t>{/}</w:t>
+      </w:r>
+      <w:r>
+        <w:rPr>
+          <w:lang w:val="uk-UA"/>
+        </w:rPr>
+        <w:t>{#</w:t>
+      </w:r>
+      <w:r>
+        <w:rPr>
+          <w:lang w:val="en-US"/>
+        </w:rPr>
+        <w:t>ownerPerson</w:t>
+      </w:r>
+      <w:r>
+        <w:rPr>
+          <w:lang w:val="uk-UA"/>
+        </w:rPr>
+        <w:t>.</w:t>
+      </w:r>
+      <w:r>
+        <w:rPr>
+          <w:lang w:val="en-US"/>
+        </w:rPr>
+        <w:t>passportNumber</w:t>
+      </w:r>
+      <w:r>
+        <w:rPr>
+          <w:lang w:val="uk-UA"/>
+        </w:rPr>
+        <w:t xml:space="preserve">}, </w:t>
+      </w:r>
+      <w:r>
+        <w:rPr>
+          <w:rStyle w:val="Highlighted-boldChar"/>
+          <w:lang w:val="uk-UA"/>
+        </w:rPr>
+        <w:t>паспорт № {</w:t>
+      </w:r>
+      <w:r>
+        <w:rPr>
+          <w:rStyle w:val="Highlighted-boldChar"/>
+          <w:lang w:val="en-US"/>
+        </w:rPr>
+        <w:t>ownerPerson</w:t>
+      </w:r>
+      <w:r>
+        <w:rPr>
+          <w:rStyle w:val="Highlighted-boldChar"/>
+          <w:lang w:val="uk-UA"/>
+        </w:rPr>
+        <w:t>.</w:t>
+      </w:r>
+      <w:r>
+        <w:rPr>
+          <w:rStyle w:val="Highlighted-boldChar"/>
+          <w:lang w:val="en-US"/>
+        </w:rPr>
+        <w:t>passportNumber</w:t>
+      </w:r>
+      <w:r>
+        <w:rPr>
+          <w:rStyle w:val="Highlighted-boldChar"/>
+          <w:lang w:val="uk-UA"/>
+        </w:rPr>
+        <w:t>}</w:t>
+      </w:r>
+      <w:r>
+        <w:rPr>
+          <w:lang w:val="uk-UA"/>
+        </w:rPr>
+        <w:t>{/}</w:t>
+      </w:r>
+      <w:r>
+        <w:rPr>
+          <w:lang w:val="uk-UA"/>
+        </w:rPr>
+        <w:t>{/}</w:t>
+      </w:r>
+      <w:r>
+        <w:rPr>
+          <w:lang w:val="uk-UA"/>
+        </w:rPr>
+        <w:t>{#</w:t>
+      </w:r>
+      <w:r>
+        <w:rPr>
+          <w:lang w:val="en-US"/>
+        </w:rPr>
+        <w:t>ownerOrganization</w:t>
+      </w:r>
+      <w:r>
+        <w:rPr>
+          <w:lang w:val="uk-UA"/>
+        </w:rPr>
+        <w:t>.</w:t>
+      </w:r>
+      <w:r>
+        <w:rPr>
+          <w:lang w:val="en-US"/>
+        </w:rPr>
+        <w:t>title</w:t>
+      </w:r>
+      <w:r>
+        <w:rPr>
+          <w:lang w:val="uk-UA"/>
+        </w:rPr>
+        <w:t>}</w:t>
+      </w:r>
+      <w:r>
+        <w:rPr>
+          <w:rStyle w:val="Highlighted-boldChar"/>
+          <w:lang w:val="uk-UA"/>
+        </w:rPr>
+        <w:t>{</w:t>
+      </w:r>
+      <w:r>
+        <w:rPr>
+          <w:rStyle w:val="Highlighted-boldChar"/>
+          <w:lang w:val="en-US"/>
+        </w:rPr>
+        <w:t>ownerOrganization</w:t>
+      </w:r>
+      <w:r>
+        <w:rPr>
+          <w:rStyle w:val="Highlighted-boldChar"/>
+          <w:lang w:val="uk-UA"/>
+        </w:rPr>
+        <w:t>.</w:t>
+      </w:r>
+      <w:r>
+        <w:rPr>
+          <w:rStyle w:val="Highlighted-boldChar"/>
+          <w:lang w:val="en-US"/>
+        </w:rPr>
+        <w:t>title</w:t>
+      </w:r>
+      <w:r>
+        <w:rPr>
+          <w:rStyle w:val="Highlighted-boldChar"/>
+          <w:lang w:val="uk-UA"/>
+        </w:rPr>
+        <w:t>}</w:t>
+      </w:r>
+      <w:r>
+        <w:rPr>
+          <w:lang w:val="uk-UA"/>
+        </w:rPr>
+        <w:t>{#</w:t>
+      </w:r>
+      <w:r>
+        <w:rPr>
+          <w:lang w:val="en-US"/>
+        </w:rPr>
+        <w:t>ownerOrganization</w:t>
+      </w:r>
+      <w:r>
+        <w:rPr>
+          <w:lang w:val="uk-UA"/>
+        </w:rPr>
+        <w:t>.</w:t>
+      </w:r>
+      <w:r>
+        <w:rPr>
+          <w:lang w:val="en-US"/>
+        </w:rPr>
+        <w:t>code</w:t>
+      </w:r>
+      <w:r>
+        <w:rPr>
+          <w:lang w:val="uk-UA"/>
+        </w:rPr>
+        <w:t xml:space="preserve">} </w:t>
+      </w:r>
+      <w:r>
+        <w:rPr>
+          <w:rStyle w:val="Highlighted-boldChar"/>
+          <w:lang w:val="uk-UA"/>
+        </w:rPr>
+        <w:t>(код</w:t>
+      </w:r>
+      <w:r>
+        <w:rPr>
+          <w:rStyle w:val="Highlighted-boldChar"/>
+          <w:lang w:val="uk-UA"/>
+        </w:rPr>
+        <w:t xml:space="preserve"> </w:t>
+      </w:r>
+      <w:r>
+        <w:rPr>
+          <w:rStyle w:val="Highlighted-boldChar"/>
+          <w:lang w:val="uk-UA"/>
+        </w:rPr>
+        <w:t>згідно з</w:t>
+      </w:r>
+      <w:r>
+        <w:rPr>
+          <w:rStyle w:val="Highlighted-boldChar"/>
+          <w:lang w:val="uk-UA"/>
+        </w:rPr>
+        <w:t xml:space="preserve"> ЄДРПОУ </w:t>
+      </w:r>
+      <w:r>
+        <w:rPr>
+          <w:rStyle w:val="Highlighted-boldChar"/>
+          <w:lang w:val="uk-UA"/>
+        </w:rPr>
+        <w:t>{</w:t>
+      </w:r>
+      <w:r>
+        <w:rPr>
+          <w:rStyle w:val="Highlighted-boldChar"/>
+          <w:lang w:val="en-US"/>
+        </w:rPr>
+        <w:t>ownerOrganization</w:t>
+      </w:r>
+      <w:r>
+        <w:rPr>
+          <w:rStyle w:val="Highlighted-boldChar"/>
+          <w:lang w:val="uk-UA"/>
+        </w:rPr>
+        <w:t>.</w:t>
+      </w:r>
+      <w:r>
+        <w:rPr>
+          <w:rStyle w:val="Highlighted-boldChar"/>
+          <w:lang w:val="en-US"/>
+        </w:rPr>
+        <w:t>code</w:t>
+      </w:r>
+      <w:r>
+        <w:rPr>
+          <w:rStyle w:val="Highlighted-boldChar"/>
+          <w:lang w:val="uk-UA"/>
+        </w:rPr>
+        <w:t>}</w:t>
+      </w:r>
+      <w:r>
+        <w:rPr>
+          <w:rStyle w:val="Highlighted-boldChar"/>
           <w:lang w:val="uk-UA"/>
         </w:rPr>
         <w:t>)</w:t>
       </w:r>
       <w:r>
         <w:rPr>
-          <w:rStyle w:val="AlertChar"/>
+          <w:lang w:val="uk-UA"/>
+        </w:rPr>
+        <w:t>{/}{/}</w:t>
+      </w:r>
+      <w:r>
+        <w:rPr>
+          <w:lang w:val="uk-UA"/>
+        </w:rPr>
+        <w:t>.</w:t>
+      </w:r>
+      <w:r>
+        <w:rPr>
+          <w:lang w:val="uk-UA"/>
+        </w:rPr>
+        <w:t xml:space="preserve"> </w:t>
+      </w:r>
+      <w:r>
+        <w:rPr>
+          <w:lang w:val="uk-UA"/>
+        </w:rPr>
+        <w:t>{#</w:t>
+      </w:r>
+      <w:r>
+        <w:rPr>
+          <w:lang w:val="en-US"/>
+        </w:rPr>
+        <w:t>ownershipInfo</w:t>
+      </w:r>
+      <w:r>
+        <w:rPr>
+          <w:lang w:val="uk-UA"/>
+        </w:rPr>
+        <w:t>}</w:t>
+      </w:r>
+      <w:r>
+        <w:rPr>
+          <w:lang w:val="uk-UA"/>
+        </w:rPr>
+        <w:t>Інформація про речові права, похідні від права власності</w:t>
+      </w:r>
+      <w:r>
+        <w:rPr>
+          <w:lang w:val="uk-UA"/>
+        </w:rPr>
+        <w:t xml:space="preserve">: </w:t>
+      </w:r>
+      <w:r>
+        <w:rPr>
+          <w:lang w:val="uk-UA"/>
+        </w:rPr>
+        <w:t>{</w:t>
+      </w:r>
+      <w:r>
+        <w:rPr>
+          <w:lang w:val="en-US"/>
+        </w:rPr>
+        <w:t>ownershipInfo</w:t>
+      </w:r>
+      <w:r>
+        <w:rPr>
+          <w:lang w:val="uk-UA"/>
+        </w:rPr>
+        <w:t>}</w:t>
+      </w:r>
+      <w:r>
+        <w:rPr>
           <w:lang w:val="uk-UA"/>
         </w:rPr>
         <w:t>{/}</w:t>
-      </w:r>
-      <w:r>
-        <w:rPr>
-          <w:lang w:val="uk-UA"/>
-        </w:rPr>
-        <w:t>{#</w:t>
-      </w:r>
-      <w:r>
-        <w:rPr>
-          <w:lang w:val="en-US"/>
-        </w:rPr>
-        <w:t>ownerPerson</w:t>
-      </w:r>
-      <w:r>
-        <w:rPr>
-          <w:lang w:val="uk-UA"/>
-        </w:rPr>
-        <w:t>.</w:t>
-      </w:r>
-      <w:r>
-        <w:rPr>
-          <w:lang w:val="en-US"/>
-        </w:rPr>
-        <w:t>family</w:t>
-      </w:r>
-      <w:r>
-        <w:rPr>
-          <w:lang w:val="en-US"/>
-        </w:rPr>
-        <w:t>Name</w:t>
-      </w:r>
-      <w:r>
-        <w:rPr>
-          <w:lang w:val="uk-UA"/>
-        </w:rPr>
-        <w:t>}</w:t>
-      </w:r>
-      <w:r>
-        <w:rPr>
-          <w:lang w:val="uk-UA"/>
-        </w:rPr>
-        <w:t xml:space="preserve">, </w:t>
-      </w:r>
-      <w:r>
-        <w:rPr>
-          <w:rStyle w:val="Highlighted-boldChar"/>
-          <w:lang w:val="uk-UA"/>
-        </w:rPr>
-        <w:t>{</w:t>
-      </w:r>
-      <w:r>
-        <w:rPr>
-          <w:rStyle w:val="Highlighted-boldChar"/>
-          <w:lang w:val="en-US"/>
-        </w:rPr>
-        <w:t>ownerPerson</w:t>
-      </w:r>
-      <w:r>
-        <w:rPr>
-          <w:rStyle w:val="Highlighted-boldChar"/>
-          <w:lang w:val="uk-UA"/>
-        </w:rPr>
-        <w:t>.</w:t>
-      </w:r>
-      <w:r>
-        <w:rPr>
-          <w:rStyle w:val="Highlighted-boldChar"/>
-          <w:lang w:val="en-US"/>
-        </w:rPr>
-        <w:t>familyName</w:t>
-      </w:r>
-      <w:r>
-        <w:rPr>
-          <w:rStyle w:val="Highlighted-boldChar"/>
-          <w:lang w:val="uk-UA"/>
-        </w:rPr>
-        <w:t>} {</w:t>
-      </w:r>
-      <w:r>
-        <w:rPr>
-          <w:rStyle w:val="Highlighted-boldChar"/>
-          <w:lang w:val="en-US"/>
-        </w:rPr>
-        <w:t>ownerPerson</w:t>
-      </w:r>
-      <w:r>
-        <w:rPr>
-          <w:rStyle w:val="Highlighted-boldChar"/>
-          <w:lang w:val="uk-UA"/>
-        </w:rPr>
-        <w:t>.</w:t>
-      </w:r>
-      <w:r>
-        <w:rPr>
-          <w:rStyle w:val="Highlighted-boldChar"/>
-          <w:lang w:val="en-US"/>
-        </w:rPr>
-        <w:t>givenName</w:t>
-      </w:r>
-      <w:r>
-        <w:rPr>
-          <w:rStyle w:val="Highlighted-boldChar"/>
-          <w:lang w:val="uk-UA"/>
-        </w:rPr>
-        <w:t xml:space="preserve"> | </w:t>
-      </w:r>
-      <w:r>
-        <w:rPr>
-          <w:rStyle w:val="Highlighted-boldChar"/>
-          <w:lang w:val="en-US"/>
-        </w:rPr>
-        <w:t>safe</w:t>
-      </w:r>
-      <w:r>
-        <w:rPr>
-          <w:rStyle w:val="Highlighted-boldChar"/>
-          <w:lang w:val="uk-UA"/>
-        </w:rPr>
-        <w:t>} {</w:t>
-      </w:r>
-      <w:r>
-        <w:rPr>
-          <w:rStyle w:val="Highlighted-boldChar"/>
-          <w:lang w:val="en-US"/>
-        </w:rPr>
-        <w:t>ownerPerson</w:t>
-      </w:r>
-      <w:r>
-        <w:rPr>
-          <w:rStyle w:val="Highlighted-boldChar"/>
-          <w:lang w:val="uk-UA"/>
-        </w:rPr>
-        <w:t>.</w:t>
-      </w:r>
-      <w:r>
-        <w:rPr>
-          <w:rStyle w:val="Highlighted-boldChar"/>
-          <w:lang w:val="en-US"/>
-        </w:rPr>
-        <w:t>additionalName</w:t>
-      </w:r>
-      <w:r>
-        <w:rPr>
-          <w:rStyle w:val="Highlighted-boldChar"/>
-          <w:lang w:val="uk-UA"/>
-        </w:rPr>
-        <w:t xml:space="preserve"> | </w:t>
-      </w:r>
-      <w:r>
-        <w:rPr>
-          <w:rStyle w:val="Highlighted-boldChar"/>
-          <w:lang w:val="en-US"/>
-        </w:rPr>
-        <w:t>safe</w:t>
-      </w:r>
-      <w:r>
-        <w:rPr>
-          <w:rStyle w:val="Highlighted-boldChar"/>
-          <w:lang w:val="uk-UA"/>
-        </w:rPr>
-        <w:t>}</w:t>
-      </w:r>
-      <w:r>
-        <w:rPr>
-          <w:lang w:val="uk-UA"/>
-        </w:rPr>
-        <w:t xml:space="preserve"> </w:t>
-      </w:r>
-      <w:r>
-        <w:rPr>
-          <w:lang w:val="uk-UA"/>
-        </w:rPr>
-        <w:t>{#</w:t>
-      </w:r>
-      <w:r>
-        <w:rPr>
-          <w:lang w:val="en-US"/>
-        </w:rPr>
-        <w:t>ownerPerson</w:t>
-      </w:r>
-      <w:r>
-        <w:rPr>
-          <w:lang w:val="uk-UA"/>
-        </w:rPr>
-        <w:t>.</w:t>
-      </w:r>
-      <w:r>
-        <w:rPr>
-          <w:lang w:val="en-US"/>
-        </w:rPr>
-        <w:t>taxId</w:t>
-      </w:r>
-      <w:r>
-        <w:rPr>
-          <w:lang w:val="uk-UA"/>
-        </w:rPr>
-        <w:t xml:space="preserve">}, </w:t>
-      </w:r>
-      <w:r>
-        <w:rPr>
-          <w:rStyle w:val="Highlighted-boldChar"/>
-          <w:lang w:val="uk-UA"/>
-        </w:rPr>
-        <w:t>РНОКПП – {</w:t>
-      </w:r>
-      <w:r>
-        <w:rPr>
-          <w:rStyle w:val="Highlighted-boldChar"/>
-          <w:lang w:val="en-US"/>
-        </w:rPr>
-        <w:t>ownerPerson</w:t>
-      </w:r>
-      <w:r>
-        <w:rPr>
-          <w:rStyle w:val="Highlighted-boldChar"/>
-          <w:lang w:val="uk-UA"/>
-        </w:rPr>
-        <w:t>.</w:t>
-      </w:r>
-      <w:r>
-        <w:rPr>
-          <w:rStyle w:val="Highlighted-boldChar"/>
-          <w:lang w:val="en-US"/>
-        </w:rPr>
-        <w:t>taxId</w:t>
-      </w:r>
-      <w:r>
-        <w:rPr>
-          <w:rStyle w:val="Highlighted-boldChar"/>
-          <w:lang w:val="uk-UA"/>
-        </w:rPr>
-        <w:t>}</w:t>
-      </w:r>
-      <w:r>
-        <w:rPr>
-          <w:lang w:val="uk-UA"/>
-        </w:rPr>
-        <w:t>{/}</w:t>
-      </w:r>
-      <w:r>
-        <w:rPr>
-          <w:lang w:val="uk-UA"/>
-        </w:rPr>
-        <w:t>{#</w:t>
-      </w:r>
-      <w:r>
-        <w:rPr>
-          <w:lang w:val="en-US"/>
-        </w:rPr>
-        <w:t>ownerPerson</w:t>
-      </w:r>
-      <w:r>
-        <w:rPr>
-          <w:lang w:val="uk-UA"/>
-        </w:rPr>
-        <w:t>.</w:t>
-      </w:r>
-      <w:r>
-        <w:rPr>
-          <w:lang w:val="en-US"/>
-        </w:rPr>
-        <w:t>passportNumber</w:t>
-      </w:r>
-      <w:r>
-        <w:rPr>
-          <w:lang w:val="uk-UA"/>
-        </w:rPr>
-        <w:t xml:space="preserve">}, </w:t>
-      </w:r>
-      <w:r>
-        <w:rPr>
-          <w:rStyle w:val="Highlighted-boldChar"/>
-          <w:lang w:val="uk-UA"/>
-        </w:rPr>
-        <w:t>паспорт № {</w:t>
-      </w:r>
-      <w:r>
-        <w:rPr>
-          <w:rStyle w:val="Highlighted-boldChar"/>
-          <w:lang w:val="en-US"/>
-        </w:rPr>
-        <w:t>ownerPerson</w:t>
-      </w:r>
-      <w:r>
-        <w:rPr>
-          <w:rStyle w:val="Highlighted-boldChar"/>
-          <w:lang w:val="uk-UA"/>
-        </w:rPr>
-        <w:t>.</w:t>
-      </w:r>
-      <w:r>
-        <w:rPr>
-          <w:rStyle w:val="Highlighted-boldChar"/>
-          <w:lang w:val="en-US"/>
-        </w:rPr>
-        <w:t>passportNumber</w:t>
-      </w:r>
-      <w:r>
-        <w:rPr>
-          <w:rStyle w:val="Highlighted-boldChar"/>
-          <w:lang w:val="uk-UA"/>
-        </w:rPr>
-        <w:t>}</w:t>
-      </w:r>
-      <w:r>
-        <w:rPr>
-          <w:lang w:val="uk-UA"/>
-        </w:rPr>
-        <w:t>{/}</w:t>
-      </w:r>
-      <w:r>
-        <w:rPr>
-          <w:lang w:val="uk-UA"/>
-        </w:rPr>
-        <w:t>{/}</w:t>
-      </w:r>
-      <w:r>
-        <w:rPr>
-          <w:lang w:val="uk-UA"/>
-        </w:rPr>
-        <w:t>{#</w:t>
-      </w:r>
-      <w:r>
-        <w:rPr>
-          <w:lang w:val="en-US"/>
-        </w:rPr>
-        <w:t>ownerOrganization</w:t>
-      </w:r>
-      <w:r>
-        <w:rPr>
-          <w:lang w:val="uk-UA"/>
-        </w:rPr>
-        <w:t>.</w:t>
-      </w:r>
-      <w:r>
-        <w:rPr>
-          <w:lang w:val="en-US"/>
-        </w:rPr>
-        <w:t>title</w:t>
-      </w:r>
-      <w:r>
-        <w:rPr>
-          <w:lang w:val="uk-UA"/>
-        </w:rPr>
-        <w:t>}</w:t>
-      </w:r>
-      <w:r>
-        <w:rPr>
-          <w:rStyle w:val="Highlighted-boldChar"/>
-          <w:lang w:val="uk-UA"/>
-        </w:rPr>
-        <w:t>{</w:t>
-      </w:r>
-      <w:r>
-        <w:rPr>
-          <w:rStyle w:val="Highlighted-boldChar"/>
-          <w:lang w:val="en-US"/>
-        </w:rPr>
-        <w:t>ownerOrganization</w:t>
-      </w:r>
-      <w:r>
-        <w:rPr>
-          <w:rStyle w:val="Highlighted-boldChar"/>
-          <w:lang w:val="uk-UA"/>
-        </w:rPr>
-        <w:t>.</w:t>
-      </w:r>
-      <w:r>
-        <w:rPr>
-          <w:rStyle w:val="Highlighted-boldChar"/>
-          <w:lang w:val="en-US"/>
-        </w:rPr>
-        <w:t>title</w:t>
-      </w:r>
-      <w:r>
-        <w:rPr>
-          <w:rStyle w:val="Highlighted-boldChar"/>
-          <w:lang w:val="uk-UA"/>
-        </w:rPr>
-        <w:t>}</w:t>
-      </w:r>
-      <w:r>
-        <w:rPr>
-          <w:lang w:val="uk-UA"/>
-        </w:rPr>
-        <w:t>{#</w:t>
-      </w:r>
-      <w:r>
-        <w:rPr>
-          <w:lang w:val="en-US"/>
-        </w:rPr>
-        <w:t>ownerOrganization</w:t>
-      </w:r>
-      <w:r>
-        <w:rPr>
-          <w:lang w:val="uk-UA"/>
-        </w:rPr>
-        <w:t>.</w:t>
-      </w:r>
-      <w:r>
-        <w:rPr>
-          <w:lang w:val="en-US"/>
-        </w:rPr>
-        <w:t>code</w:t>
-      </w:r>
-      <w:r>
-        <w:rPr>
-          <w:lang w:val="uk-UA"/>
-        </w:rPr>
-        <w:t xml:space="preserve">} </w:t>
-      </w:r>
-      <w:r>
-        <w:rPr>
-          <w:rStyle w:val="Highlighted-boldChar"/>
-          <w:lang w:val="uk-UA"/>
-        </w:rPr>
-        <w:t>(код</w:t>
-      </w:r>
-      <w:r>
-        <w:rPr>
-          <w:rStyle w:val="Highlighted-boldChar"/>
-          <w:lang w:val="uk-UA"/>
-        </w:rPr>
-        <w:t xml:space="preserve"> </w:t>
-      </w:r>
-      <w:r>
-        <w:rPr>
-          <w:rStyle w:val="Highlighted-boldChar"/>
-          <w:lang w:val="uk-UA"/>
-        </w:rPr>
-        <w:t>згідно з</w:t>
-      </w:r>
-      <w:r>
-        <w:rPr>
-          <w:rStyle w:val="Highlighted-boldChar"/>
-          <w:lang w:val="uk-UA"/>
-        </w:rPr>
-        <w:t xml:space="preserve"> ЄДРПОУ </w:t>
-      </w:r>
-      <w:r>
-        <w:rPr>
-          <w:rStyle w:val="Highlighted-boldChar"/>
-          <w:lang w:val="uk-UA"/>
-        </w:rPr>
-        <w:t>{</w:t>
-      </w:r>
-      <w:r>
-        <w:rPr>
-          <w:rStyle w:val="Highlighted-boldChar"/>
-          <w:lang w:val="en-US"/>
-        </w:rPr>
-        <w:t>ownerOrganization</w:t>
-      </w:r>
-      <w:r>
-        <w:rPr>
-          <w:rStyle w:val="Highlighted-boldChar"/>
-          <w:lang w:val="uk-UA"/>
-        </w:rPr>
-        <w:t>.</w:t>
-      </w:r>
-      <w:r>
-        <w:rPr>
-          <w:rStyle w:val="Highlighted-boldChar"/>
-          <w:lang w:val="en-US"/>
-        </w:rPr>
-        <w:t>code</w:t>
-      </w:r>
-      <w:r>
-        <w:rPr>
-          <w:rStyle w:val="Highlighted-boldChar"/>
-          <w:lang w:val="uk-UA"/>
-        </w:rPr>
-        <w:t>}</w:t>
-      </w:r>
-      <w:r>
-        <w:rPr>
-          <w:rStyle w:val="Highlighted-boldChar"/>
-          <w:lang w:val="uk-UA"/>
-        </w:rPr>
-        <w:t>)</w:t>
-      </w:r>
-      <w:r>
-        <w:rPr>
-          <w:lang w:val="uk-UA"/>
-        </w:rPr>
-        <w:t>{/}{/}</w:t>
-      </w:r>
-      <w:r>
-        <w:rPr>
-          <w:lang w:val="uk-UA"/>
-        </w:rPr>
-        <w:t>.</w:t>
       </w:r>
     </w:p>
     <w:p>
@@ -3172,7 +3197,7 @@
         <w:rPr>
           <w:lang w:val="en-US"/>
         </w:rPr>
-        <w:t>formOfOwnership</w:t>
+        <w:t>ownershipType</w:t>
       </w:r>
       <w:r>
         <w:rPr>
@@ -3210,7 +3235,7 @@
           <w:rStyle w:val="Highlighted-boldChar"/>
           <w:lang w:val="en-US"/>
         </w:rPr>
-        <w:t>formOfOwnership</w:t>
+        <w:t>ownershipType</w:t>
       </w:r>
       <w:r>
         <w:rPr>
@@ -12358,8 +12383,26 @@
               <w:rPr>
                 <w:lang w:val="en-AU"/>
               </w:rPr>
+              <w:t>{</w:t>
+            </w:r>
+            <w:r>
+              <w:rPr>
+                <w:lang w:val="en-US"/>
+              </w:rPr>
+              <w:t xml:space="preserve"> </w:t>
+            </w:r>
+            <w:r>
+              <w:rPr>
+                <w:lang w:val="en-US"/>
+              </w:rPr>
               <w:lastRenderedPageBreak/>
-              <w:t>{constructionElements.ventilation</w:t>
+              <w:t>internalSystems</w:t>
+            </w:r>
+            <w:r>
+              <w:rPr>
+                <w:lang w:val="en-AU"/>
+              </w:rPr>
+              <w:t>.ventilation</w:t>
             </w:r>
             <w:r>
               <w:rPr>
@@ -13073,12 +13116,27 @@
       </w:r>
       <w:r>
         <w:rPr>
-          <w:lang w:val="en-US"/>
-        </w:rPr>
-        <w:t>{#conclusionType==='</w:t>
-      </w:r>
-      <w:r>
-        <w:t>Інший</w:t>
+          <w:lang w:val="uk-UA"/>
+        </w:rPr>
+        <w:t xml:space="preserve">. </w:t>
+      </w:r>
+      <w:r>
+        <w:rPr>
+          <w:lang w:val="en-US"/>
+        </w:rPr>
+        <w:t>{#</w:t>
+      </w:r>
+      <w:r>
+        <w:rPr>
+          <w:lang w:val="en-US"/>
+        </w:rPr>
+        <w:t>conclusionText</w:t>
+      </w:r>
+      <w:r>
+        <w:rPr>
+          <w:lang w:val="en-US"/>
+        </w:rPr>
+        <w:t>}</w:t>
       </w:r>
       <w:r>
         <w:rPr>
@@ -13087,26 +13145,27 @@
         <w:t xml:space="preserve"> </w:t>
       </w:r>
       <w:r>
-        <w:t>висновок</w:t>
-      </w:r>
-      <w:r>
-        <w:rPr>
-          <w:lang w:val="en-US"/>
-        </w:rPr>
-        <w:t>'}</w:t>
-      </w:r>
-      <w:r>
-        <w:rPr>
-          <w:lang w:val="en-US"/>
-        </w:rPr>
-        <w:t xml:space="preserve">: </w:t>
-      </w:r>
-      <w:r>
-        <w:rPr>
-          <w:rStyle w:val="Highlighted-boldChar"/>
-          <w:lang w:val="en-US"/>
-        </w:rPr>
-        <w:t>{conclusionText}</w:t>
+        <w:rPr>
+          <w:rStyle w:val="Highlighted-boldChar"/>
+          <w:lang w:val="en-US"/>
+        </w:rPr>
+        <w:t>{</w:t>
+      </w:r>
+      <w:bookmarkStart w:id="6" w:name="_Hlk226556108"/>
+      <w:r>
+        <w:rPr>
+          <w:rStyle w:val="Highlighted-boldChar"/>
+          <w:lang w:val="en-US"/>
+        </w:rPr>
+        <w:t>conclusionText</w:t>
+      </w:r>
+      <w:bookmarkEnd w:id="6"/>
+      <w:r>
+        <w:rPr>
+          <w:rStyle w:val="Highlighted-boldChar"/>
+          <w:lang w:val="en-US"/>
+        </w:rPr>
+        <w:t>}</w:t>
       </w:r>
       <w:r>
         <w:rPr>
@@ -14727,7 +14786,7 @@
         </w:rPr>
         <w:t>{#!</w:t>
       </w:r>
-      <w:bookmarkStart w:id="6" w:name="_Hlk216711411"/>
+      <w:bookmarkStart w:id="7" w:name="_Hlk216711411"/>
       <w:r>
         <w:rPr>
           <w:rStyle w:val="AlertChar"/>
@@ -14783,7 +14842,7 @@
         </w:rPr>
         <w:t>)</w:t>
       </w:r>
-      <w:bookmarkEnd w:id="6"/>
+      <w:bookmarkEnd w:id="7"/>
       <w:r>
         <w:rPr>
           <w:rStyle w:val="AlertChar"/>
@@ -14950,7 +15009,7 @@
         </w:rPr>
         <w:t>{#!</w:t>
       </w:r>
-      <w:bookmarkStart w:id="7" w:name="_Hlk216711430"/>
+      <w:bookmarkStart w:id="8" w:name="_Hlk216711430"/>
       <w:r>
         <w:rPr>
           <w:rStyle w:val="AlertChar"/>
@@ -14999,7 +15058,7 @@
         </w:rPr>
         <w:t>)</w:t>
       </w:r>
-      <w:bookmarkEnd w:id="7"/>
+      <w:bookmarkEnd w:id="8"/>
       <w:r>
         <w:rPr>
           <w:rStyle w:val="AlertChar"/>
@@ -15196,7 +15255,7 @@
         </w:rPr>
         <w:t>!</w:t>
       </w:r>
-      <w:bookmarkStart w:id="8" w:name="_Hlk216711449"/>
+      <w:bookmarkStart w:id="9" w:name="_Hlk216711449"/>
       <w:r>
         <w:rPr>
           <w:rStyle w:val="AlertChar"/>
@@ -15244,7 +15303,7 @@
         </w:rPr>
         <w:t>)</w:t>
       </w:r>
-      <w:bookmarkEnd w:id="8"/>
+      <w:bookmarkEnd w:id="9"/>
       <w:r>
         <w:rPr>
           <w:rStyle w:val="AlertChar"/>
@@ -15406,7 +15465,7 @@
         </w:rPr>
         <w:t>{#!</w:t>
       </w:r>
-      <w:bookmarkStart w:id="9" w:name="_Hlk216711468"/>
+      <w:bookmarkStart w:id="10" w:name="_Hlk216711468"/>
       <w:r>
         <w:rPr>
           <w:rStyle w:val="AlertChar"/>
@@ -15454,7 +15513,7 @@
         </w:rPr>
         <w:t>)</w:t>
       </w:r>
-      <w:bookmarkEnd w:id="9"/>
+      <w:bookmarkEnd w:id="10"/>
       <w:r>
         <w:rPr>
           <w:rStyle w:val="AlertChar"/>
@@ -15809,7 +15868,7 @@
         </w:rPr>
         <w:t>{#!</w:t>
       </w:r>
-      <w:bookmarkStart w:id="10" w:name="_Hlk216711663"/>
+      <w:bookmarkStart w:id="11" w:name="_Hlk216711663"/>
       <w:r>
         <w:rPr>
           <w:rStyle w:val="AlertChar"/>
@@ -15856,7 +15915,7 @@
         </w:rPr>
         <w:t>)</w:t>
       </w:r>
-      <w:bookmarkEnd w:id="10"/>
+      <w:bookmarkEnd w:id="11"/>
       <w:r>
         <w:rPr>
           <w:rStyle w:val="AlertChar"/>
@@ -16002,7 +16061,7 @@
         </w:rPr>
         <w:t>{#!</w:t>
       </w:r>
-      <w:bookmarkStart w:id="11" w:name="_Hlk216711714"/>
+      <w:bookmarkStart w:id="12" w:name="_Hlk216711714"/>
       <w:r>
         <w:rPr>
           <w:rStyle w:val="AlertChar"/>
@@ -16049,7 +16108,7 @@
         </w:rPr>
         <w:t>)</w:t>
       </w:r>
-      <w:bookmarkEnd w:id="11"/>
+      <w:bookmarkEnd w:id="12"/>
       <w:r>
         <w:rPr>
           <w:rStyle w:val="AlertChar"/>
@@ -17816,16 +17875,28 @@
         <w:rPr>
           <w:lang w:val="uk-UA"/>
         </w:rPr>
-        <w:t>{/}{#</w:t>
-      </w:r>
-      <w:r>
-        <w:t>conclusionType</w:t>
-      </w:r>
-      <w:r>
-        <w:rPr>
-          <w:lang w:val="uk-UA"/>
-        </w:rPr>
-        <w:t xml:space="preserve">==='Інший висновок'}: </w:t>
+        <w:t>{/}</w:t>
+      </w:r>
+      <w:r>
+        <w:rPr>
+          <w:lang w:val="uk-UA"/>
+        </w:rPr>
+        <w:t xml:space="preserve">. </w:t>
+      </w:r>
+      <w:r>
+        <w:rPr>
+          <w:lang w:val="uk-UA"/>
+        </w:rPr>
+        <w:t>{#</w:t>
+      </w:r>
+      <w:r>
+        <w:t>conclusionText</w:t>
+      </w:r>
+      <w:r>
+        <w:rPr>
+          <w:lang w:val="uk-UA"/>
+        </w:rPr>
+        <w:t xml:space="preserve">}: </w:t>
       </w:r>
       <w:r>
         <w:rPr>
@@ -18481,7 +18552,7 @@
           <w:rStyle w:val="AlertChar"/>
           <w:lang w:val="en-US"/>
         </w:rPr>
-        <w:t>formOfOwnership</w:t>
+        <w:t>ownershipType</w:t>
       </w:r>
       <w:r>
         <w:rPr>
@@ -18500,7 +18571,7 @@
         <w:rPr>
           <w:lang w:val="en-US"/>
         </w:rPr>
-        <w:t>formOfOwnership</w:t>
+        <w:t>ownershipType</w:t>
       </w:r>
       <w:r>
         <w:rPr>
@@ -18520,7 +18591,7 @@
           <w:rStyle w:val="Highlighted-boldChar"/>
           <w:lang w:val="en-US"/>
         </w:rPr>
-        <w:t>formOfOwnership</w:t>
+        <w:t>ownershipType</w:t>
       </w:r>
       <w:r>
         <w:rPr>
@@ -18974,14 +19045,14 @@
         </w:rPr>
         <w:t>{#</w:t>
       </w:r>
-      <w:bookmarkStart w:id="12" w:name="_Hlk216360829"/>
+      <w:bookmarkStart w:id="13" w:name="_Hlk216360829"/>
       <w:r>
         <w:rPr>
           <w:lang w:val="en-US"/>
         </w:rPr>
         <w:t>landDocument</w:t>
       </w:r>
-      <w:bookmarkEnd w:id="12"/>
+      <w:bookmarkEnd w:id="13"/>
       <w:r>
         <w:rPr>
           <w:lang w:val="uk-UA"/>
@@ -19540,67 +19611,28 @@
         <w:t>{#conclusionType}{conclusionType}{/}</w:t>
       </w:r>
       <w:r>
-        <w:t xml:space="preserve">{#conclusionType==='Інший висновок'}: </w:t>
-      </w:r>
-      <w:r>
-        <w:rPr>
-          <w:rStyle w:val="AlertChar"/>
-        </w:rPr>
-        <w:t>{</w:t>
-      </w:r>
-      <w:r>
-        <w:rPr>
-          <w:rStyle w:val="AlertChar"/>
-        </w:rPr>
-        <w:t>#!</w:t>
-      </w:r>
-      <w:r>
-        <w:rPr>
-          <w:rStyle w:val="AlertChar"/>
-        </w:rPr>
-        <w:t>conclusionText}не зазначений{/}</w:t>
-      </w:r>
-      <w:r>
-        <w:rPr>
-          <w:rStyle w:val="Highlighted-boldChar"/>
-        </w:rPr>
-        <w:t>{</w:t>
-      </w:r>
-      <w:r>
-        <w:rPr>
-          <w:rStyle w:val="Highlighted-boldChar"/>
-        </w:rPr>
+        <w:rPr>
+          <w:lang w:val="uk-UA"/>
+        </w:rPr>
+        <w:t>.</w:t>
+      </w:r>
+      <w:r>
+        <w:t xml:space="preserve"> {</w:t>
+      </w:r>
+      <w:r>
         <w:t>#</w:t>
       </w:r>
       <w:r>
-        <w:rPr>
-          <w:rStyle w:val="Highlighted-boldChar"/>
-        </w:rPr>
-        <w:t>conclusionText}</w:t>
+        <w:t>conclusionText</w:t>
+      </w:r>
+      <w:r>
+        <w:t xml:space="preserve">} </w:t>
       </w:r>
       <w:r>
         <w:rPr>
           <w:rStyle w:val="Highlighted-boldChar"/>
         </w:rPr>
         <w:t>{conclusionText}</w:t>
-      </w:r>
-      <w:r>
-        <w:rPr>
-          <w:rStyle w:val="Highlighted-boldChar"/>
-        </w:rPr>
-        <w:t>{</w:t>
-      </w:r>
-      <w:r>
-        <w:rPr>
-          <w:rStyle w:val="Highlighted-boldChar"/>
-        </w:rPr>
-        <w:t>/</w:t>
-      </w:r>
-      <w:r>
-        <w:rPr>
-          <w:rStyle w:val="Highlighted-boldChar"/>
-        </w:rPr>
-        <w:t>}</w:t>
       </w:r>
       <w:r>
         <w:t>{/}</w:t>

</xml_diff>